<commit_message>
docs: synchronize all architecture diagrams, test cases, presentations, and API specifications
</commit_message>
<xml_diff>
--- a/docs/Cost_Estimation_and_Budget.docx
+++ b/docs/Cost_Estimation_and_Budget.docx
@@ -4,71 +4,151 @@
   <w:body>
     <w:p>
       <w:pPr>
-        <w:pStyle w:val="Heading1"/>
-        <w:spacing w:before="240" w:after="120"/>
+        <w:spacing w:before="280" w:after="120"/>
       </w:pPr>
       <w:r>
         <w:rPr>
-          <w:rFonts w:ascii="Georgia" w:hAnsi="Georgia"/>
+          <w:rFonts w:ascii="Playfair Display" w:hAnsi="Playfair Display"/>
           <w:b/>
           <w:color w:val="721F3A"/>
-          <w:sz w:val="36"/>
+          <w:sz w:val="44"/>
         </w:rPr>
         <w:t>MagulaPlan (Magula.lk) — Cost Estimation, Budget &amp; Business Model</w:t>
       </w:r>
     </w:p>
     <w:p>
       <w:pPr>
-        <w:pStyle w:val="Heading2"/>
-        <w:spacing w:before="200" w:after="80"/>
+        <w:spacing w:before="240" w:after="80"/>
       </w:pPr>
       <w:r>
         <w:rPr>
-          <w:rFonts w:ascii="Georgia" w:hAnsi="Georgia"/>
+          <w:rFonts w:ascii="Playfair Display" w:hAnsi="Playfair Display"/>
           <w:b/>
           <w:color w:val="721F3A"/>
-          <w:sz w:val="28"/>
+          <w:sz w:val="30"/>
         </w:rPr>
         <w:t>1. Cost Estimation &amp; Budget Overview</w:t>
       </w:r>
     </w:p>
     <w:p>
       <w:pPr>
-        <w:spacing w:before="40" w:after="80"/>
+        <w:spacing w:after="80"/>
       </w:pPr>
       <w:r>
         <w:rPr>
-          <w:rFonts w:ascii="Calibri" w:hAnsi="Calibri"/>
+          <w:rFonts w:ascii="Segoe UI" w:hAnsi="Segoe UI"/>
           <w:color w:val="222222"/>
-          <w:sz w:val="20"/>
+          <w:sz w:val="19"/>
         </w:rPr>
-        <w:t>In accordance with academic project management guidelines (Section 1.4: Cost Estimation), this document establishes the planned and actual costs across Software, Cloud Infrastructure, Hardware Workstations, and Human Resources.</w:t>
+        <w:t>In accordance with academic project management guidelines (</w:t>
+      </w:r>
+      <w:r>
+        <w:rPr>
+          <w:rFonts w:ascii="Segoe UI" w:hAnsi="Segoe UI"/>
+          <w:b/>
+          <w:color w:val="222222"/>
+          <w:sz w:val="19"/>
+        </w:rPr>
+        <w:t>Section 1.4: Cost Estimation</w:t>
+      </w:r>
+      <w:r>
+        <w:rPr>
+          <w:rFonts w:ascii="Segoe UI" w:hAnsi="Segoe UI"/>
+          <w:color w:val="222222"/>
+          <w:sz w:val="19"/>
+        </w:rPr>
+        <w:t xml:space="preserve">), this document establishes the planned and actual costs across </w:t>
+      </w:r>
+      <w:r>
+        <w:rPr>
+          <w:rFonts w:ascii="Segoe UI" w:hAnsi="Segoe UI"/>
+          <w:b/>
+          <w:color w:val="222222"/>
+          <w:sz w:val="19"/>
+        </w:rPr>
+        <w:t>Software</w:t>
+      </w:r>
+      <w:r>
+        <w:rPr>
+          <w:rFonts w:ascii="Segoe UI" w:hAnsi="Segoe UI"/>
+          <w:color w:val="222222"/>
+          <w:sz w:val="19"/>
+        </w:rPr>
+        <w:t xml:space="preserve">, </w:t>
+      </w:r>
+      <w:r>
+        <w:rPr>
+          <w:rFonts w:ascii="Segoe UI" w:hAnsi="Segoe UI"/>
+          <w:b/>
+          <w:color w:val="222222"/>
+          <w:sz w:val="19"/>
+        </w:rPr>
+        <w:t>Cloud Infrastructure</w:t>
+      </w:r>
+      <w:r>
+        <w:rPr>
+          <w:rFonts w:ascii="Segoe UI" w:hAnsi="Segoe UI"/>
+          <w:color w:val="222222"/>
+          <w:sz w:val="19"/>
+        </w:rPr>
+        <w:t xml:space="preserve">, </w:t>
+      </w:r>
+      <w:r>
+        <w:rPr>
+          <w:rFonts w:ascii="Segoe UI" w:hAnsi="Segoe UI"/>
+          <w:b/>
+          <w:color w:val="222222"/>
+          <w:sz w:val="19"/>
+        </w:rPr>
+        <w:t>Hardware Workstations</w:t>
+      </w:r>
+      <w:r>
+        <w:rPr>
+          <w:rFonts w:ascii="Segoe UI" w:hAnsi="Segoe UI"/>
+          <w:color w:val="222222"/>
+          <w:sz w:val="19"/>
+        </w:rPr>
+        <w:t xml:space="preserve">, and </w:t>
+      </w:r>
+      <w:r>
+        <w:rPr>
+          <w:rFonts w:ascii="Segoe UI" w:hAnsi="Segoe UI"/>
+          <w:b/>
+          <w:color w:val="222222"/>
+          <w:sz w:val="19"/>
+        </w:rPr>
+        <w:t>Human Resources</w:t>
+      </w:r>
+      <w:r>
+        <w:rPr>
+          <w:rFonts w:ascii="Segoe UI" w:hAnsi="Segoe UI"/>
+          <w:color w:val="222222"/>
+          <w:sz w:val="19"/>
+        </w:rPr>
+        <w:t>.</w:t>
       </w:r>
     </w:p>
     <w:p>
       <w:pPr>
-        <w:spacing w:before="40" w:after="80"/>
+        <w:spacing w:before="120" w:after="120"/>
       </w:pPr>
       <w:r>
         <w:rPr>
-          <w:rFonts w:ascii="Calibri" w:hAnsi="Calibri"/>
-          <w:color w:val="222222"/>
-          <w:sz w:val="20"/>
+          <w:color w:val="EEDDE0"/>
         </w:rPr>
-        <w:t>---</w:t>
+        <w:t>__________________________________________________________________________</w:t>
       </w:r>
     </w:p>
     <w:p>
       <w:pPr>
-        <w:pStyle w:val="Heading2"/>
-        <w:spacing w:before="200" w:after="80"/>
+        <w:spacing w:before="240" w:after="80"/>
       </w:pPr>
       <w:r>
         <w:rPr>
-          <w:rFonts w:ascii="Georgia" w:hAnsi="Georgia"/>
+          <w:rFonts w:ascii="Playfair Display" w:hAnsi="Playfair Display"/>
           <w:b/>
           <w:color w:val="721F3A"/>
-          <w:sz w:val="28"/>
+          <w:sz w:val="30"/>
         </w:rPr>
         <w:t>2. Planned vs. Actual Budget Table</w:t>
       </w:r>
@@ -80,35 +160,32 @@
         <w:tblLook w:firstColumn="1" w:firstRow="1" w:lastColumn="0" w:lastRow="0" w:noHBand="0" w:noVBand="1" w:val="04A0"/>
       </w:tblPr>
       <w:tblGrid>
-        <w:gridCol w:w="1560"/>
-        <w:gridCol w:w="1560"/>
-        <w:gridCol w:w="1560"/>
-        <w:gridCol w:w="1560"/>
-        <w:gridCol w:w="1560"/>
-        <w:gridCol w:w="1560"/>
+        <w:gridCol w:w="1608"/>
+        <w:gridCol w:w="1608"/>
+        <w:gridCol w:w="1608"/>
+        <w:gridCol w:w="1608"/>
+        <w:gridCol w:w="1608"/>
+        <w:gridCol w:w="1608"/>
       </w:tblGrid>
       <w:tr>
         <w:tc>
           <w:tcPr>
-            <w:tcW w:type="dxa" w:w="1560"/>
+            <w:tcW w:type="dxa" w:w="1608"/>
+            <w:tcMar>
+              <w:top w:w="100" w:type="dxa"/>
+              <w:bottom w:w="100" w:type="dxa"/>
+              <w:left w:w="120" w:type="dxa"/>
+              <w:right w:w="120" w:type="dxa"/>
+            </w:tcMar>
             <w:shd w:fill="721F3A"/>
-            <w:tcMar>
-              <w:top w:w="120" w:type="dxa"/>
-              <w:bottom w:w="120" w:type="dxa"/>
-              <w:left w:w="150" w:type="dxa"/>
-              <w:right w:w="150" w:type="dxa"/>
-            </w:tcMar>
           </w:tcPr>
           <w:p>
-            <w:pPr>
-              <w:spacing w:before="40" w:after="40"/>
-            </w:pPr>
             <w:r>
               <w:rPr>
-                <w:rFonts w:ascii="Calibri" w:hAnsi="Calibri"/>
+                <w:rFonts w:ascii="Segoe UI" w:hAnsi="Segoe UI"/>
                 <w:b/>
                 <w:color w:val="FFFFFF"/>
-                <w:sz w:val="19"/>
+                <w:sz w:val="18"/>
               </w:rPr>
               <w:t>Resource Category / Item</w:t>
             </w:r>
@@ -116,25 +193,22 @@
         </w:tc>
         <w:tc>
           <w:tcPr>
-            <w:tcW w:type="dxa" w:w="1560"/>
+            <w:tcW w:type="dxa" w:w="1608"/>
+            <w:tcMar>
+              <w:top w:w="100" w:type="dxa"/>
+              <w:bottom w:w="100" w:type="dxa"/>
+              <w:left w:w="120" w:type="dxa"/>
+              <w:right w:w="120" w:type="dxa"/>
+            </w:tcMar>
             <w:shd w:fill="721F3A"/>
-            <w:tcMar>
-              <w:top w:w="120" w:type="dxa"/>
-              <w:bottom w:w="120" w:type="dxa"/>
-              <w:left w:w="150" w:type="dxa"/>
-              <w:right w:w="150" w:type="dxa"/>
-            </w:tcMar>
           </w:tcPr>
           <w:p>
-            <w:pPr>
-              <w:spacing w:before="40" w:after="40"/>
-            </w:pPr>
             <w:r>
               <w:rPr>
-                <w:rFonts w:ascii="Calibri" w:hAnsi="Calibri"/>
+                <w:rFonts w:ascii="Segoe UI" w:hAnsi="Segoe UI"/>
                 <w:b/>
                 <w:color w:val="FFFFFF"/>
-                <w:sz w:val="19"/>
+                <w:sz w:val="18"/>
               </w:rPr>
               <w:t>Description &amp; Purpose</w:t>
             </w:r>
@@ -142,25 +216,22 @@
         </w:tc>
         <w:tc>
           <w:tcPr>
-            <w:tcW w:type="dxa" w:w="1560"/>
+            <w:tcW w:type="dxa" w:w="1608"/>
+            <w:tcMar>
+              <w:top w:w="100" w:type="dxa"/>
+              <w:bottom w:w="100" w:type="dxa"/>
+              <w:left w:w="120" w:type="dxa"/>
+              <w:right w:w="120" w:type="dxa"/>
+            </w:tcMar>
             <w:shd w:fill="721F3A"/>
-            <w:tcMar>
-              <w:top w:w="120" w:type="dxa"/>
-              <w:bottom w:w="120" w:type="dxa"/>
-              <w:left w:w="150" w:type="dxa"/>
-              <w:right w:w="150" w:type="dxa"/>
-            </w:tcMar>
           </w:tcPr>
           <w:p>
-            <w:pPr>
-              <w:spacing w:before="40" w:after="40"/>
-            </w:pPr>
             <w:r>
               <w:rPr>
-                <w:rFonts w:ascii="Calibri" w:hAnsi="Calibri"/>
+                <w:rFonts w:ascii="Segoe UI" w:hAnsi="Segoe UI"/>
                 <w:b/>
                 <w:color w:val="FFFFFF"/>
-                <w:sz w:val="19"/>
+                <w:sz w:val="18"/>
               </w:rPr>
               <w:t>Planned Budget (LKR)</w:t>
             </w:r>
@@ -168,25 +239,22 @@
         </w:tc>
         <w:tc>
           <w:tcPr>
-            <w:tcW w:type="dxa" w:w="1560"/>
+            <w:tcW w:type="dxa" w:w="1608"/>
+            <w:tcMar>
+              <w:top w:w="100" w:type="dxa"/>
+              <w:bottom w:w="100" w:type="dxa"/>
+              <w:left w:w="120" w:type="dxa"/>
+              <w:right w:w="120" w:type="dxa"/>
+            </w:tcMar>
             <w:shd w:fill="721F3A"/>
-            <w:tcMar>
-              <w:top w:w="120" w:type="dxa"/>
-              <w:bottom w:w="120" w:type="dxa"/>
-              <w:left w:w="150" w:type="dxa"/>
-              <w:right w:w="150" w:type="dxa"/>
-            </w:tcMar>
           </w:tcPr>
           <w:p>
-            <w:pPr>
-              <w:spacing w:before="40" w:after="40"/>
-            </w:pPr>
             <w:r>
               <w:rPr>
-                <w:rFonts w:ascii="Calibri" w:hAnsi="Calibri"/>
+                <w:rFonts w:ascii="Segoe UI" w:hAnsi="Segoe UI"/>
                 <w:b/>
                 <w:color w:val="FFFFFF"/>
-                <w:sz w:val="19"/>
+                <w:sz w:val="18"/>
               </w:rPr>
               <w:t>Actual Budget (LKR)</w:t>
             </w:r>
@@ -194,25 +262,22 @@
         </w:tc>
         <w:tc>
           <w:tcPr>
-            <w:tcW w:type="dxa" w:w="1560"/>
+            <w:tcW w:type="dxa" w:w="1608"/>
+            <w:tcMar>
+              <w:top w:w="100" w:type="dxa"/>
+              <w:bottom w:w="100" w:type="dxa"/>
+              <w:left w:w="120" w:type="dxa"/>
+              <w:right w:w="120" w:type="dxa"/>
+            </w:tcMar>
             <w:shd w:fill="721F3A"/>
-            <w:tcMar>
-              <w:top w:w="120" w:type="dxa"/>
-              <w:bottom w:w="120" w:type="dxa"/>
-              <w:left w:w="150" w:type="dxa"/>
-              <w:right w:w="150" w:type="dxa"/>
-            </w:tcMar>
           </w:tcPr>
           <w:p>
-            <w:pPr>
-              <w:spacing w:before="40" w:after="40"/>
-            </w:pPr>
             <w:r>
               <w:rPr>
-                <w:rFonts w:ascii="Calibri" w:hAnsi="Calibri"/>
+                <w:rFonts w:ascii="Segoe UI" w:hAnsi="Segoe UI"/>
                 <w:b/>
                 <w:color w:val="FFFFFF"/>
-                <w:sz w:val="19"/>
+                <w:sz w:val="18"/>
               </w:rPr>
               <w:t>Variance (Savings)</w:t>
             </w:r>
@@ -220,25 +285,22 @@
         </w:tc>
         <w:tc>
           <w:tcPr>
-            <w:tcW w:type="dxa" w:w="1560"/>
+            <w:tcW w:type="dxa" w:w="1608"/>
+            <w:tcMar>
+              <w:top w:w="100" w:type="dxa"/>
+              <w:bottom w:w="100" w:type="dxa"/>
+              <w:left w:w="120" w:type="dxa"/>
+              <w:right w:w="120" w:type="dxa"/>
+            </w:tcMar>
             <w:shd w:fill="721F3A"/>
-            <w:tcMar>
-              <w:top w:w="120" w:type="dxa"/>
-              <w:bottom w:w="120" w:type="dxa"/>
-              <w:left w:w="150" w:type="dxa"/>
-              <w:right w:w="150" w:type="dxa"/>
-            </w:tcMar>
           </w:tcPr>
           <w:p>
-            <w:pPr>
-              <w:spacing w:before="40" w:after="40"/>
-            </w:pPr>
             <w:r>
               <w:rPr>
-                <w:rFonts w:ascii="Calibri" w:hAnsi="Calibri"/>
+                <w:rFonts w:ascii="Segoe UI" w:hAnsi="Segoe UI"/>
                 <w:b/>
                 <w:color w:val="FFFFFF"/>
-                <w:sz w:val="19"/>
+                <w:sz w:val="18"/>
               </w:rPr>
               <w:t>Optimization Strategy &amp; Justification</w:t>
             </w:r>
@@ -248,47 +310,43 @@
       <w:tr>
         <w:tc>
           <w:tcPr>
-            <w:tcW w:type="dxa" w:w="1560"/>
+            <w:tcW w:type="dxa" w:w="1608"/>
             <w:tcMar>
-              <w:top w:w="80" w:type="dxa"/>
-              <w:bottom w:w="80" w:type="dxa"/>
-              <w:left w:w="150" w:type="dxa"/>
-              <w:right w:w="150" w:type="dxa"/>
+              <w:top w:w="100" w:type="dxa"/>
+              <w:bottom w:w="100" w:type="dxa"/>
+              <w:left w:w="120" w:type="dxa"/>
+              <w:right w:w="120" w:type="dxa"/>
             </w:tcMar>
+            <w:shd w:fill="FAF7F2"/>
           </w:tcPr>
           <w:p>
-            <w:pPr>
-              <w:spacing w:before="40" w:after="40"/>
-            </w:pPr>
             <w:r>
               <w:rPr>
-                <w:rFonts w:ascii="Calibri" w:hAnsi="Calibri"/>
-                <w:color w:val="333333"/>
-                <w:sz w:val="18"/>
+                <w:rFonts w:ascii="Segoe UI" w:hAnsi="Segoe UI"/>
+                <w:color w:val="222222"/>
+                <w:sz w:val="17"/>
               </w:rPr>
-              <w:t>Human Resources (5 Engineers)</w:t>
+              <w:t>**Human Resources (5 Engineers)**</w:t>
             </w:r>
           </w:p>
         </w:tc>
         <w:tc>
           <w:tcPr>
-            <w:tcW w:type="dxa" w:w="1560"/>
+            <w:tcW w:type="dxa" w:w="1608"/>
             <w:tcMar>
-              <w:top w:w="80" w:type="dxa"/>
-              <w:bottom w:w="80" w:type="dxa"/>
-              <w:left w:w="150" w:type="dxa"/>
-              <w:right w:w="150" w:type="dxa"/>
+              <w:top w:w="100" w:type="dxa"/>
+              <w:bottom w:w="100" w:type="dxa"/>
+              <w:left w:w="120" w:type="dxa"/>
+              <w:right w:w="120" w:type="dxa"/>
             </w:tcMar>
+            <w:shd w:fill="FAF7F2"/>
           </w:tcPr>
           <w:p>
-            <w:pPr>
-              <w:spacing w:before="40" w:after="40"/>
-            </w:pPr>
             <w:r>
               <w:rPr>
-                <w:rFonts w:ascii="Calibri" w:hAnsi="Calibri"/>
-                <w:color w:val="333333"/>
-                <w:sz w:val="18"/>
+                <w:rFonts w:ascii="Segoe UI" w:hAnsi="Segoe UI"/>
+                <w:color w:val="222222"/>
+                <w:sz w:val="17"/>
               </w:rPr>
               <w:t>480 person-hours across Project Management, Backend, Frontend, Database, and QA Engineering (@ LKR 1,500/hr market rate)</w:t>
             </w:r>
@@ -296,23 +354,21 @@
         </w:tc>
         <w:tc>
           <w:tcPr>
-            <w:tcW w:type="dxa" w:w="1560"/>
+            <w:tcW w:type="dxa" w:w="1608"/>
             <w:tcMar>
-              <w:top w:w="80" w:type="dxa"/>
-              <w:bottom w:w="80" w:type="dxa"/>
-              <w:left w:w="150" w:type="dxa"/>
-              <w:right w:w="150" w:type="dxa"/>
+              <w:top w:w="100" w:type="dxa"/>
+              <w:bottom w:w="100" w:type="dxa"/>
+              <w:left w:w="120" w:type="dxa"/>
+              <w:right w:w="120" w:type="dxa"/>
             </w:tcMar>
+            <w:shd w:fill="FAF7F2"/>
           </w:tcPr>
           <w:p>
-            <w:pPr>
-              <w:spacing w:before="40" w:after="40"/>
-            </w:pPr>
             <w:r>
               <w:rPr>
-                <w:rFonts w:ascii="Calibri" w:hAnsi="Calibri"/>
-                <w:color w:val="333333"/>
-                <w:sz w:val="18"/>
+                <w:rFonts w:ascii="Segoe UI" w:hAnsi="Segoe UI"/>
+                <w:color w:val="222222"/>
+                <w:sz w:val="17"/>
               </w:rPr>
               <w:t>LKR 720,000</w:t>
             </w:r>
@@ -320,23 +376,21 @@
         </w:tc>
         <w:tc>
           <w:tcPr>
-            <w:tcW w:type="dxa" w:w="1560"/>
+            <w:tcW w:type="dxa" w:w="1608"/>
             <w:tcMar>
-              <w:top w:w="80" w:type="dxa"/>
-              <w:bottom w:w="80" w:type="dxa"/>
-              <w:left w:w="150" w:type="dxa"/>
-              <w:right w:w="150" w:type="dxa"/>
+              <w:top w:w="100" w:type="dxa"/>
+              <w:bottom w:w="100" w:type="dxa"/>
+              <w:left w:w="120" w:type="dxa"/>
+              <w:right w:w="120" w:type="dxa"/>
             </w:tcMar>
+            <w:shd w:fill="FAF7F2"/>
           </w:tcPr>
           <w:p>
-            <w:pPr>
-              <w:spacing w:before="40" w:after="40"/>
-            </w:pPr>
             <w:r>
               <w:rPr>
-                <w:rFonts w:ascii="Calibri" w:hAnsi="Calibri"/>
-                <w:color w:val="333333"/>
-                <w:sz w:val="18"/>
+                <w:rFonts w:ascii="Segoe UI" w:hAnsi="Segoe UI"/>
+                <w:color w:val="222222"/>
+                <w:sz w:val="17"/>
               </w:rPr>
               <w:t>LKR 720,000</w:t>
             </w:r>
@@ -344,23 +398,21 @@
         </w:tc>
         <w:tc>
           <w:tcPr>
-            <w:tcW w:type="dxa" w:w="1560"/>
+            <w:tcW w:type="dxa" w:w="1608"/>
             <w:tcMar>
-              <w:top w:w="80" w:type="dxa"/>
-              <w:bottom w:w="80" w:type="dxa"/>
-              <w:left w:w="150" w:type="dxa"/>
-              <w:right w:w="150" w:type="dxa"/>
+              <w:top w:w="100" w:type="dxa"/>
+              <w:bottom w:w="100" w:type="dxa"/>
+              <w:left w:w="120" w:type="dxa"/>
+              <w:right w:w="120" w:type="dxa"/>
             </w:tcMar>
+            <w:shd w:fill="FAF7F2"/>
           </w:tcPr>
           <w:p>
-            <w:pPr>
-              <w:spacing w:before="40" w:after="40"/>
-            </w:pPr>
             <w:r>
               <w:rPr>
-                <w:rFonts w:ascii="Calibri" w:hAnsi="Calibri"/>
-                <w:color w:val="333333"/>
-                <w:sz w:val="18"/>
+                <w:rFonts w:ascii="Segoe UI" w:hAnsi="Segoe UI"/>
+                <w:color w:val="222222"/>
+                <w:sz w:val="17"/>
               </w:rPr>
               <w:t>LKR 0</w:t>
             </w:r>
@@ -368,23 +420,21 @@
         </w:tc>
         <w:tc>
           <w:tcPr>
-            <w:tcW w:type="dxa" w:w="1560"/>
+            <w:tcW w:type="dxa" w:w="1608"/>
             <w:tcMar>
-              <w:top w:w="80" w:type="dxa"/>
-              <w:bottom w:w="80" w:type="dxa"/>
-              <w:left w:w="150" w:type="dxa"/>
-              <w:right w:w="150" w:type="dxa"/>
+              <w:top w:w="100" w:type="dxa"/>
+              <w:bottom w:w="100" w:type="dxa"/>
+              <w:left w:w="120" w:type="dxa"/>
+              <w:right w:w="120" w:type="dxa"/>
             </w:tcMar>
+            <w:shd w:fill="FAF7F2"/>
           </w:tcPr>
           <w:p>
-            <w:pPr>
-              <w:spacing w:before="40" w:after="40"/>
-            </w:pPr>
             <w:r>
               <w:rPr>
-                <w:rFonts w:ascii="Calibri" w:hAnsi="Calibri"/>
-                <w:color w:val="333333"/>
-                <w:sz w:val="18"/>
+                <w:rFonts w:ascii="Segoe UI" w:hAnsi="Segoe UI"/>
+                <w:color w:val="222222"/>
+                <w:sz w:val="17"/>
               </w:rPr>
               <w:t>Internal student engineering team allocation; 100% effort accounted.</w:t>
             </w:r>
@@ -394,49 +444,41 @@
       <w:tr>
         <w:tc>
           <w:tcPr>
-            <w:tcW w:type="dxa" w:w="1560"/>
-            <w:shd w:fill="FBF8F9"/>
+            <w:tcW w:type="dxa" w:w="1608"/>
             <w:tcMar>
-              <w:top w:w="80" w:type="dxa"/>
-              <w:bottom w:w="80" w:type="dxa"/>
-              <w:left w:w="150" w:type="dxa"/>
-              <w:right w:w="150" w:type="dxa"/>
+              <w:top w:w="100" w:type="dxa"/>
+              <w:bottom w:w="100" w:type="dxa"/>
+              <w:left w:w="120" w:type="dxa"/>
+              <w:right w:w="120" w:type="dxa"/>
             </w:tcMar>
           </w:tcPr>
           <w:p>
-            <w:pPr>
-              <w:spacing w:before="40" w:after="40"/>
-            </w:pPr>
             <w:r>
               <w:rPr>
-                <w:rFonts w:ascii="Calibri" w:hAnsi="Calibri"/>
-                <w:color w:val="333333"/>
-                <w:sz w:val="18"/>
+                <w:rFonts w:ascii="Segoe UI" w:hAnsi="Segoe UI"/>
+                <w:color w:val="222222"/>
+                <w:sz w:val="17"/>
               </w:rPr>
-              <w:t>Backend Cloud Hosting (Render)</w:t>
+              <w:t>**Backend Cloud Hosting (Render)**</w:t>
             </w:r>
           </w:p>
         </w:tc>
         <w:tc>
           <w:tcPr>
-            <w:tcW w:type="dxa" w:w="1560"/>
-            <w:shd w:fill="FBF8F9"/>
+            <w:tcW w:type="dxa" w:w="1608"/>
             <w:tcMar>
-              <w:top w:w="80" w:type="dxa"/>
-              <w:bottom w:w="80" w:type="dxa"/>
-              <w:left w:w="150" w:type="dxa"/>
-              <w:right w:w="150" w:type="dxa"/>
+              <w:top w:w="100" w:type="dxa"/>
+              <w:bottom w:w="100" w:type="dxa"/>
+              <w:left w:w="120" w:type="dxa"/>
+              <w:right w:w="120" w:type="dxa"/>
             </w:tcMar>
           </w:tcPr>
           <w:p>
-            <w:pPr>
-              <w:spacing w:before="40" w:after="40"/>
-            </w:pPr>
             <w:r>
               <w:rPr>
-                <w:rFonts w:ascii="Calibri" w:hAnsi="Calibri"/>
-                <w:color w:val="333333"/>
-                <w:sz w:val="18"/>
+                <w:rFonts w:ascii="Segoe UI" w:hAnsi="Segoe UI"/>
+                <w:color w:val="222222"/>
+                <w:sz w:val="17"/>
               </w:rPr>
               <w:t>Spring Boot 4.1 REST API container runtime</w:t>
             </w:r>
@@ -444,24 +486,20 @@
         </w:tc>
         <w:tc>
           <w:tcPr>
-            <w:tcW w:type="dxa" w:w="1560"/>
-            <w:shd w:fill="FBF8F9"/>
+            <w:tcW w:type="dxa" w:w="1608"/>
             <w:tcMar>
-              <w:top w:w="80" w:type="dxa"/>
-              <w:bottom w:w="80" w:type="dxa"/>
-              <w:left w:w="150" w:type="dxa"/>
-              <w:right w:w="150" w:type="dxa"/>
+              <w:top w:w="100" w:type="dxa"/>
+              <w:bottom w:w="100" w:type="dxa"/>
+              <w:left w:w="120" w:type="dxa"/>
+              <w:right w:w="120" w:type="dxa"/>
             </w:tcMar>
           </w:tcPr>
           <w:p>
-            <w:pPr>
-              <w:spacing w:before="40" w:after="40"/>
-            </w:pPr>
             <w:r>
               <w:rPr>
-                <w:rFonts w:ascii="Calibri" w:hAnsi="Calibri"/>
-                <w:color w:val="333333"/>
-                <w:sz w:val="18"/>
+                <w:rFonts w:ascii="Segoe UI" w:hAnsi="Segoe UI"/>
+                <w:color w:val="222222"/>
+                <w:sz w:val="17"/>
               </w:rPr>
               <w:t>LKR 25,000</w:t>
             </w:r>
@@ -469,24 +507,20 @@
         </w:tc>
         <w:tc>
           <w:tcPr>
-            <w:tcW w:type="dxa" w:w="1560"/>
-            <w:shd w:fill="FBF8F9"/>
+            <w:tcW w:type="dxa" w:w="1608"/>
             <w:tcMar>
-              <w:top w:w="80" w:type="dxa"/>
-              <w:bottom w:w="80" w:type="dxa"/>
-              <w:left w:w="150" w:type="dxa"/>
-              <w:right w:w="150" w:type="dxa"/>
+              <w:top w:w="100" w:type="dxa"/>
+              <w:bottom w:w="100" w:type="dxa"/>
+              <w:left w:w="120" w:type="dxa"/>
+              <w:right w:w="120" w:type="dxa"/>
             </w:tcMar>
           </w:tcPr>
           <w:p>
-            <w:pPr>
-              <w:spacing w:before="40" w:after="40"/>
-            </w:pPr>
             <w:r>
               <w:rPr>
-                <w:rFonts w:ascii="Calibri" w:hAnsi="Calibri"/>
-                <w:color w:val="333333"/>
-                <w:sz w:val="18"/>
+                <w:rFonts w:ascii="Segoe UI" w:hAnsi="Segoe UI"/>
+                <w:color w:val="222222"/>
+                <w:sz w:val="17"/>
               </w:rPr>
               <w:t>LKR 0</w:t>
             </w:r>
@@ -494,24 +528,20 @@
         </w:tc>
         <w:tc>
           <w:tcPr>
-            <w:tcW w:type="dxa" w:w="1560"/>
-            <w:shd w:fill="FBF8F9"/>
+            <w:tcW w:type="dxa" w:w="1608"/>
             <w:tcMar>
-              <w:top w:w="80" w:type="dxa"/>
-              <w:bottom w:w="80" w:type="dxa"/>
-              <w:left w:w="150" w:type="dxa"/>
-              <w:right w:w="150" w:type="dxa"/>
+              <w:top w:w="100" w:type="dxa"/>
+              <w:bottom w:w="100" w:type="dxa"/>
+              <w:left w:w="120" w:type="dxa"/>
+              <w:right w:w="120" w:type="dxa"/>
             </w:tcMar>
           </w:tcPr>
           <w:p>
-            <w:pPr>
-              <w:spacing w:before="40" w:after="40"/>
-            </w:pPr>
             <w:r>
               <w:rPr>
-                <w:rFonts w:ascii="Calibri" w:hAnsi="Calibri"/>
-                <w:color w:val="333333"/>
-                <w:sz w:val="18"/>
+                <w:rFonts w:ascii="Segoe UI" w:hAnsi="Segoe UI"/>
+                <w:color w:val="222222"/>
+                <w:sz w:val="17"/>
               </w:rPr>
               <w:t>+LKR 25,000</w:t>
             </w:r>
@@ -519,24 +549,20 @@
         </w:tc>
         <w:tc>
           <w:tcPr>
-            <w:tcW w:type="dxa" w:w="1560"/>
-            <w:shd w:fill="FBF8F9"/>
+            <w:tcW w:type="dxa" w:w="1608"/>
             <w:tcMar>
-              <w:top w:w="80" w:type="dxa"/>
-              <w:bottom w:w="80" w:type="dxa"/>
-              <w:left w:w="150" w:type="dxa"/>
-              <w:right w:w="150" w:type="dxa"/>
+              <w:top w:w="100" w:type="dxa"/>
+              <w:bottom w:w="100" w:type="dxa"/>
+              <w:left w:w="120" w:type="dxa"/>
+              <w:right w:w="120" w:type="dxa"/>
             </w:tcMar>
           </w:tcPr>
           <w:p>
-            <w:pPr>
-              <w:spacing w:before="40" w:after="40"/>
-            </w:pPr>
             <w:r>
               <w:rPr>
-                <w:rFonts w:ascii="Calibri" w:hAnsi="Calibri"/>
-                <w:color w:val="333333"/>
-                <w:sz w:val="18"/>
+                <w:rFonts w:ascii="Segoe UI" w:hAnsi="Segoe UI"/>
+                <w:color w:val="222222"/>
+                <w:sz w:val="17"/>
               </w:rPr>
               <w:t>Leveraged Render Free Web Service tier with health-check keep-alive scripts.</w:t>
             </w:r>
@@ -546,47 +572,43 @@
       <w:tr>
         <w:tc>
           <w:tcPr>
-            <w:tcW w:type="dxa" w:w="1560"/>
+            <w:tcW w:type="dxa" w:w="1608"/>
             <w:tcMar>
-              <w:top w:w="80" w:type="dxa"/>
-              <w:bottom w:w="80" w:type="dxa"/>
-              <w:left w:w="150" w:type="dxa"/>
-              <w:right w:w="150" w:type="dxa"/>
+              <w:top w:w="100" w:type="dxa"/>
+              <w:bottom w:w="100" w:type="dxa"/>
+              <w:left w:w="120" w:type="dxa"/>
+              <w:right w:w="120" w:type="dxa"/>
             </w:tcMar>
+            <w:shd w:fill="FAF7F2"/>
           </w:tcPr>
           <w:p>
-            <w:pPr>
-              <w:spacing w:before="40" w:after="40"/>
-            </w:pPr>
             <w:r>
               <w:rPr>
-                <w:rFonts w:ascii="Calibri" w:hAnsi="Calibri"/>
-                <w:color w:val="333333"/>
-                <w:sz w:val="18"/>
+                <w:rFonts w:ascii="Segoe UI" w:hAnsi="Segoe UI"/>
+                <w:color w:val="222222"/>
+                <w:sz w:val="17"/>
               </w:rPr>
-              <w:t>Frontend CDN Hosting (Netlify / InfinityFree)</w:t>
+              <w:t>**Frontend CDN Hosting (Netlify / InfinityFree)**</w:t>
             </w:r>
           </w:p>
         </w:tc>
         <w:tc>
           <w:tcPr>
-            <w:tcW w:type="dxa" w:w="1560"/>
+            <w:tcW w:type="dxa" w:w="1608"/>
             <w:tcMar>
-              <w:top w:w="80" w:type="dxa"/>
-              <w:bottom w:w="80" w:type="dxa"/>
-              <w:left w:w="150" w:type="dxa"/>
-              <w:right w:w="150" w:type="dxa"/>
+              <w:top w:w="100" w:type="dxa"/>
+              <w:bottom w:w="100" w:type="dxa"/>
+              <w:left w:w="120" w:type="dxa"/>
+              <w:right w:w="120" w:type="dxa"/>
             </w:tcMar>
+            <w:shd w:fill="FAF7F2"/>
           </w:tcPr>
           <w:p>
-            <w:pPr>
-              <w:spacing w:before="40" w:after="40"/>
-            </w:pPr>
             <w:r>
               <w:rPr>
-                <w:rFonts w:ascii="Calibri" w:hAnsi="Calibri"/>
-                <w:color w:val="333333"/>
-                <w:sz w:val="18"/>
+                <w:rFonts w:ascii="Segoe UI" w:hAnsi="Segoe UI"/>
+                <w:color w:val="222222"/>
+                <w:sz w:val="17"/>
               </w:rPr>
               <w:t>React 19 SPA static web asset distribution &amp; edge routing</w:t>
             </w:r>
@@ -594,23 +616,21 @@
         </w:tc>
         <w:tc>
           <w:tcPr>
-            <w:tcW w:type="dxa" w:w="1560"/>
+            <w:tcW w:type="dxa" w:w="1608"/>
             <w:tcMar>
-              <w:top w:w="80" w:type="dxa"/>
-              <w:bottom w:w="80" w:type="dxa"/>
-              <w:left w:w="150" w:type="dxa"/>
-              <w:right w:w="150" w:type="dxa"/>
+              <w:top w:w="100" w:type="dxa"/>
+              <w:bottom w:w="100" w:type="dxa"/>
+              <w:left w:w="120" w:type="dxa"/>
+              <w:right w:w="120" w:type="dxa"/>
             </w:tcMar>
+            <w:shd w:fill="FAF7F2"/>
           </w:tcPr>
           <w:p>
-            <w:pPr>
-              <w:spacing w:before="40" w:after="40"/>
-            </w:pPr>
             <w:r>
               <w:rPr>
-                <w:rFonts w:ascii="Calibri" w:hAnsi="Calibri"/>
-                <w:color w:val="333333"/>
-                <w:sz w:val="18"/>
+                <w:rFonts w:ascii="Segoe UI" w:hAnsi="Segoe UI"/>
+                <w:color w:val="222222"/>
+                <w:sz w:val="17"/>
               </w:rPr>
               <w:t>LKR 15,000</w:t>
             </w:r>
@@ -618,23 +638,21 @@
         </w:tc>
         <w:tc>
           <w:tcPr>
-            <w:tcW w:type="dxa" w:w="1560"/>
+            <w:tcW w:type="dxa" w:w="1608"/>
             <w:tcMar>
-              <w:top w:w="80" w:type="dxa"/>
-              <w:bottom w:w="80" w:type="dxa"/>
-              <w:left w:w="150" w:type="dxa"/>
-              <w:right w:w="150" w:type="dxa"/>
+              <w:top w:w="100" w:type="dxa"/>
+              <w:bottom w:w="100" w:type="dxa"/>
+              <w:left w:w="120" w:type="dxa"/>
+              <w:right w:w="120" w:type="dxa"/>
             </w:tcMar>
+            <w:shd w:fill="FAF7F2"/>
           </w:tcPr>
           <w:p>
-            <w:pPr>
-              <w:spacing w:before="40" w:after="40"/>
-            </w:pPr>
             <w:r>
               <w:rPr>
-                <w:rFonts w:ascii="Calibri" w:hAnsi="Calibri"/>
-                <w:color w:val="333333"/>
-                <w:sz w:val="18"/>
+                <w:rFonts w:ascii="Segoe UI" w:hAnsi="Segoe UI"/>
+                <w:color w:val="222222"/>
+                <w:sz w:val="17"/>
               </w:rPr>
               <w:t>LKR 0</w:t>
             </w:r>
@@ -642,23 +660,21 @@
         </w:tc>
         <w:tc>
           <w:tcPr>
-            <w:tcW w:type="dxa" w:w="1560"/>
+            <w:tcW w:type="dxa" w:w="1608"/>
             <w:tcMar>
-              <w:top w:w="80" w:type="dxa"/>
-              <w:bottom w:w="80" w:type="dxa"/>
-              <w:left w:w="150" w:type="dxa"/>
-              <w:right w:w="150" w:type="dxa"/>
+              <w:top w:w="100" w:type="dxa"/>
+              <w:bottom w:w="100" w:type="dxa"/>
+              <w:left w:w="120" w:type="dxa"/>
+              <w:right w:w="120" w:type="dxa"/>
             </w:tcMar>
+            <w:shd w:fill="FAF7F2"/>
           </w:tcPr>
           <w:p>
-            <w:pPr>
-              <w:spacing w:before="40" w:after="40"/>
-            </w:pPr>
             <w:r>
               <w:rPr>
-                <w:rFonts w:ascii="Calibri" w:hAnsi="Calibri"/>
-                <w:color w:val="333333"/>
-                <w:sz w:val="18"/>
+                <w:rFonts w:ascii="Segoe UI" w:hAnsi="Segoe UI"/>
+                <w:color w:val="222222"/>
+                <w:sz w:val="17"/>
               </w:rPr>
               <w:t>+LKR 15,000</w:t>
             </w:r>
@@ -666,23 +682,21 @@
         </w:tc>
         <w:tc>
           <w:tcPr>
-            <w:tcW w:type="dxa" w:w="1560"/>
+            <w:tcW w:type="dxa" w:w="1608"/>
             <w:tcMar>
-              <w:top w:w="80" w:type="dxa"/>
-              <w:bottom w:w="80" w:type="dxa"/>
-              <w:left w:w="150" w:type="dxa"/>
-              <w:right w:w="150" w:type="dxa"/>
+              <w:top w:w="100" w:type="dxa"/>
+              <w:bottom w:w="100" w:type="dxa"/>
+              <w:left w:w="120" w:type="dxa"/>
+              <w:right w:w="120" w:type="dxa"/>
             </w:tcMar>
+            <w:shd w:fill="FAF7F2"/>
           </w:tcPr>
           <w:p>
-            <w:pPr>
-              <w:spacing w:before="40" w:after="40"/>
-            </w:pPr>
             <w:r>
               <w:rPr>
-                <w:rFonts w:ascii="Calibri" w:hAnsi="Calibri"/>
-                <w:color w:val="333333"/>
-                <w:sz w:val="18"/>
+                <w:rFonts w:ascii="Segoe UI" w:hAnsi="Segoe UI"/>
+                <w:color w:val="222222"/>
+                <w:sz w:val="17"/>
               </w:rPr>
               <w:t>Leveraged Netlify Global Free Tier &amp; InfinityFree unlimited bandwidth storage.</w:t>
             </w:r>
@@ -692,49 +706,41 @@
       <w:tr>
         <w:tc>
           <w:tcPr>
-            <w:tcW w:type="dxa" w:w="1560"/>
-            <w:shd w:fill="FBF8F9"/>
+            <w:tcW w:type="dxa" w:w="1608"/>
             <w:tcMar>
-              <w:top w:w="80" w:type="dxa"/>
-              <w:bottom w:w="80" w:type="dxa"/>
-              <w:left w:w="150" w:type="dxa"/>
-              <w:right w:w="150" w:type="dxa"/>
+              <w:top w:w="100" w:type="dxa"/>
+              <w:bottom w:w="100" w:type="dxa"/>
+              <w:left w:w="120" w:type="dxa"/>
+              <w:right w:w="120" w:type="dxa"/>
             </w:tcMar>
           </w:tcPr>
           <w:p>
-            <w:pPr>
-              <w:spacing w:before="40" w:after="40"/>
-            </w:pPr>
             <w:r>
               <w:rPr>
-                <w:rFonts w:ascii="Calibri" w:hAnsi="Calibri"/>
-                <w:color w:val="333333"/>
-                <w:sz w:val="18"/>
+                <w:rFonts w:ascii="Segoe UI" w:hAnsi="Segoe UI"/>
+                <w:color w:val="222222"/>
+                <w:sz w:val="17"/>
               </w:rPr>
-              <w:t>Managed Relational Database (Aiven MySQL)</w:t>
+              <w:t>**Managed Relational Database (Aiven MySQL)**</w:t>
             </w:r>
           </w:p>
         </w:tc>
         <w:tc>
           <w:tcPr>
-            <w:tcW w:type="dxa" w:w="1560"/>
-            <w:shd w:fill="FBF8F9"/>
+            <w:tcW w:type="dxa" w:w="1608"/>
             <w:tcMar>
-              <w:top w:w="80" w:type="dxa"/>
-              <w:bottom w:w="80" w:type="dxa"/>
-              <w:left w:w="150" w:type="dxa"/>
-              <w:right w:w="150" w:type="dxa"/>
+              <w:top w:w="100" w:type="dxa"/>
+              <w:bottom w:w="100" w:type="dxa"/>
+              <w:left w:w="120" w:type="dxa"/>
+              <w:right w:w="120" w:type="dxa"/>
             </w:tcMar>
           </w:tcPr>
           <w:p>
-            <w:pPr>
-              <w:spacing w:before="40" w:after="40"/>
-            </w:pPr>
             <w:r>
               <w:rPr>
-                <w:rFonts w:ascii="Calibri" w:hAnsi="Calibri"/>
-                <w:color w:val="333333"/>
-                <w:sz w:val="18"/>
+                <w:rFonts w:ascii="Segoe UI" w:hAnsi="Segoe UI"/>
+                <w:color w:val="222222"/>
+                <w:sz w:val="17"/>
               </w:rPr>
               <w:t>MySQL 8.4 transactional database with TLS/SSL encryption</w:t>
             </w:r>
@@ -742,24 +748,20 @@
         </w:tc>
         <w:tc>
           <w:tcPr>
-            <w:tcW w:type="dxa" w:w="1560"/>
-            <w:shd w:fill="FBF8F9"/>
+            <w:tcW w:type="dxa" w:w="1608"/>
             <w:tcMar>
-              <w:top w:w="80" w:type="dxa"/>
-              <w:bottom w:w="80" w:type="dxa"/>
-              <w:left w:w="150" w:type="dxa"/>
-              <w:right w:w="150" w:type="dxa"/>
+              <w:top w:w="100" w:type="dxa"/>
+              <w:bottom w:w="100" w:type="dxa"/>
+              <w:left w:w="120" w:type="dxa"/>
+              <w:right w:w="120" w:type="dxa"/>
             </w:tcMar>
           </w:tcPr>
           <w:p>
-            <w:pPr>
-              <w:spacing w:before="40" w:after="40"/>
-            </w:pPr>
             <w:r>
               <w:rPr>
-                <w:rFonts w:ascii="Calibri" w:hAnsi="Calibri"/>
-                <w:color w:val="333333"/>
-                <w:sz w:val="18"/>
+                <w:rFonts w:ascii="Segoe UI" w:hAnsi="Segoe UI"/>
+                <w:color w:val="222222"/>
+                <w:sz w:val="17"/>
               </w:rPr>
               <w:t>LKR 45,000</w:t>
             </w:r>
@@ -767,24 +769,20 @@
         </w:tc>
         <w:tc>
           <w:tcPr>
-            <w:tcW w:type="dxa" w:w="1560"/>
-            <w:shd w:fill="FBF8F9"/>
+            <w:tcW w:type="dxa" w:w="1608"/>
             <w:tcMar>
-              <w:top w:w="80" w:type="dxa"/>
-              <w:bottom w:w="80" w:type="dxa"/>
-              <w:left w:w="150" w:type="dxa"/>
-              <w:right w:w="150" w:type="dxa"/>
+              <w:top w:w="100" w:type="dxa"/>
+              <w:bottom w:w="100" w:type="dxa"/>
+              <w:left w:w="120" w:type="dxa"/>
+              <w:right w:w="120" w:type="dxa"/>
             </w:tcMar>
           </w:tcPr>
           <w:p>
-            <w:pPr>
-              <w:spacing w:before="40" w:after="40"/>
-            </w:pPr>
             <w:r>
               <w:rPr>
-                <w:rFonts w:ascii="Calibri" w:hAnsi="Calibri"/>
-                <w:color w:val="333333"/>
-                <w:sz w:val="18"/>
+                <w:rFonts w:ascii="Segoe UI" w:hAnsi="Segoe UI"/>
+                <w:color w:val="222222"/>
+                <w:sz w:val="17"/>
               </w:rPr>
               <w:t>LKR 0</w:t>
             </w:r>
@@ -792,24 +790,20 @@
         </w:tc>
         <w:tc>
           <w:tcPr>
-            <w:tcW w:type="dxa" w:w="1560"/>
-            <w:shd w:fill="FBF8F9"/>
+            <w:tcW w:type="dxa" w:w="1608"/>
             <w:tcMar>
-              <w:top w:w="80" w:type="dxa"/>
-              <w:bottom w:w="80" w:type="dxa"/>
-              <w:left w:w="150" w:type="dxa"/>
-              <w:right w:w="150" w:type="dxa"/>
+              <w:top w:w="100" w:type="dxa"/>
+              <w:bottom w:w="100" w:type="dxa"/>
+              <w:left w:w="120" w:type="dxa"/>
+              <w:right w:w="120" w:type="dxa"/>
             </w:tcMar>
           </w:tcPr>
           <w:p>
-            <w:pPr>
-              <w:spacing w:before="40" w:after="40"/>
-            </w:pPr>
             <w:r>
               <w:rPr>
-                <w:rFonts w:ascii="Calibri" w:hAnsi="Calibri"/>
-                <w:color w:val="333333"/>
-                <w:sz w:val="18"/>
+                <w:rFonts w:ascii="Segoe UI" w:hAnsi="Segoe UI"/>
+                <w:color w:val="222222"/>
+                <w:sz w:val="17"/>
               </w:rPr>
               <w:t>+LKR 45,000</w:t>
             </w:r>
@@ -817,24 +811,20 @@
         </w:tc>
         <w:tc>
           <w:tcPr>
-            <w:tcW w:type="dxa" w:w="1560"/>
-            <w:shd w:fill="FBF8F9"/>
+            <w:tcW w:type="dxa" w:w="1608"/>
             <w:tcMar>
-              <w:top w:w="80" w:type="dxa"/>
-              <w:bottom w:w="80" w:type="dxa"/>
-              <w:left w:w="150" w:type="dxa"/>
-              <w:right w:w="150" w:type="dxa"/>
+              <w:top w:w="100" w:type="dxa"/>
+              <w:bottom w:w="100" w:type="dxa"/>
+              <w:left w:w="120" w:type="dxa"/>
+              <w:right w:w="120" w:type="dxa"/>
             </w:tcMar>
           </w:tcPr>
           <w:p>
-            <w:pPr>
-              <w:spacing w:before="40" w:after="40"/>
-            </w:pPr>
             <w:r>
               <w:rPr>
-                <w:rFonts w:ascii="Calibri" w:hAnsi="Calibri"/>
-                <w:color w:val="333333"/>
-                <w:sz w:val="18"/>
+                <w:rFonts w:ascii="Segoe UI" w:hAnsi="Segoe UI"/>
+                <w:color w:val="222222"/>
+                <w:sz w:val="17"/>
               </w:rPr>
               <w:t>Utilized Aiven Cloud Free Tier for academic evaluation and schema verification.</w:t>
             </w:r>
@@ -844,47 +834,43 @@
       <w:tr>
         <w:tc>
           <w:tcPr>
-            <w:tcW w:type="dxa" w:w="1560"/>
+            <w:tcW w:type="dxa" w:w="1608"/>
             <w:tcMar>
-              <w:top w:w="80" w:type="dxa"/>
-              <w:bottom w:w="80" w:type="dxa"/>
-              <w:left w:w="150" w:type="dxa"/>
-              <w:right w:w="150" w:type="dxa"/>
+              <w:top w:w="100" w:type="dxa"/>
+              <w:bottom w:w="100" w:type="dxa"/>
+              <w:left w:w="120" w:type="dxa"/>
+              <w:right w:w="120" w:type="dxa"/>
             </w:tcMar>
+            <w:shd w:fill="FAF7F2"/>
           </w:tcPr>
           <w:p>
-            <w:pPr>
-              <w:spacing w:before="40" w:after="40"/>
-            </w:pPr>
             <w:r>
               <w:rPr>
-                <w:rFonts w:ascii="Calibri" w:hAnsi="Calibri"/>
-                <w:color w:val="333333"/>
-                <w:sz w:val="18"/>
+                <w:rFonts w:ascii="Segoe UI" w:hAnsi="Segoe UI"/>
+                <w:color w:val="222222"/>
+                <w:sz w:val="17"/>
               </w:rPr>
-              <w:t>Domain Name &amp; DNS (magulaplan.lk)</w:t>
+              <w:t>**Domain Name &amp; DNS (magulaplan.lk)**</w:t>
             </w:r>
           </w:p>
         </w:tc>
         <w:tc>
           <w:tcPr>
-            <w:tcW w:type="dxa" w:w="1560"/>
+            <w:tcW w:type="dxa" w:w="1608"/>
             <w:tcMar>
-              <w:top w:w="80" w:type="dxa"/>
-              <w:bottom w:w="80" w:type="dxa"/>
-              <w:left w:w="150" w:type="dxa"/>
-              <w:right w:w="150" w:type="dxa"/>
+              <w:top w:w="100" w:type="dxa"/>
+              <w:bottom w:w="100" w:type="dxa"/>
+              <w:left w:w="120" w:type="dxa"/>
+              <w:right w:w="120" w:type="dxa"/>
             </w:tcMar>
+            <w:shd w:fill="FAF7F2"/>
           </w:tcPr>
           <w:p>
-            <w:pPr>
-              <w:spacing w:before="40" w:after="40"/>
-            </w:pPr>
             <w:r>
               <w:rPr>
-                <w:rFonts w:ascii="Calibri" w:hAnsi="Calibri"/>
-                <w:color w:val="333333"/>
-                <w:sz w:val="18"/>
+                <w:rFonts w:ascii="Segoe UI" w:hAnsi="Segoe UI"/>
+                <w:color w:val="222222"/>
+                <w:sz w:val="17"/>
               </w:rPr>
               <w:t>Custom top-level domain registration</w:t>
             </w:r>
@@ -892,23 +878,21 @@
         </w:tc>
         <w:tc>
           <w:tcPr>
-            <w:tcW w:type="dxa" w:w="1560"/>
+            <w:tcW w:type="dxa" w:w="1608"/>
             <w:tcMar>
-              <w:top w:w="80" w:type="dxa"/>
-              <w:bottom w:w="80" w:type="dxa"/>
-              <w:left w:w="150" w:type="dxa"/>
-              <w:right w:w="150" w:type="dxa"/>
+              <w:top w:w="100" w:type="dxa"/>
+              <w:bottom w:w="100" w:type="dxa"/>
+              <w:left w:w="120" w:type="dxa"/>
+              <w:right w:w="120" w:type="dxa"/>
             </w:tcMar>
+            <w:shd w:fill="FAF7F2"/>
           </w:tcPr>
           <w:p>
-            <w:pPr>
-              <w:spacing w:before="40" w:after="40"/>
-            </w:pPr>
             <w:r>
               <w:rPr>
-                <w:rFonts w:ascii="Calibri" w:hAnsi="Calibri"/>
-                <w:color w:val="333333"/>
-                <w:sz w:val="18"/>
+                <w:rFonts w:ascii="Segoe UI" w:hAnsi="Segoe UI"/>
+                <w:color w:val="222222"/>
+                <w:sz w:val="17"/>
               </w:rPr>
               <w:t>LKR 6,500</w:t>
             </w:r>
@@ -916,23 +900,21 @@
         </w:tc>
         <w:tc>
           <w:tcPr>
-            <w:tcW w:type="dxa" w:w="1560"/>
+            <w:tcW w:type="dxa" w:w="1608"/>
             <w:tcMar>
-              <w:top w:w="80" w:type="dxa"/>
-              <w:bottom w:w="80" w:type="dxa"/>
-              <w:left w:w="150" w:type="dxa"/>
-              <w:right w:w="150" w:type="dxa"/>
+              <w:top w:w="100" w:type="dxa"/>
+              <w:bottom w:w="100" w:type="dxa"/>
+              <w:left w:w="120" w:type="dxa"/>
+              <w:right w:w="120" w:type="dxa"/>
             </w:tcMar>
+            <w:shd w:fill="FAF7F2"/>
           </w:tcPr>
           <w:p>
-            <w:pPr>
-              <w:spacing w:before="40" w:after="40"/>
-            </w:pPr>
             <w:r>
               <w:rPr>
-                <w:rFonts w:ascii="Calibri" w:hAnsi="Calibri"/>
-                <w:color w:val="333333"/>
-                <w:sz w:val="18"/>
+                <w:rFonts w:ascii="Segoe UI" w:hAnsi="Segoe UI"/>
+                <w:color w:val="222222"/>
+                <w:sz w:val="17"/>
               </w:rPr>
               <w:t>LKR 0</w:t>
             </w:r>
@@ -940,23 +922,21 @@
         </w:tc>
         <w:tc>
           <w:tcPr>
-            <w:tcW w:type="dxa" w:w="1560"/>
+            <w:tcW w:type="dxa" w:w="1608"/>
             <w:tcMar>
-              <w:top w:w="80" w:type="dxa"/>
-              <w:bottom w:w="80" w:type="dxa"/>
-              <w:left w:w="150" w:type="dxa"/>
-              <w:right w:w="150" w:type="dxa"/>
+              <w:top w:w="100" w:type="dxa"/>
+              <w:bottom w:w="100" w:type="dxa"/>
+              <w:left w:w="120" w:type="dxa"/>
+              <w:right w:w="120" w:type="dxa"/>
             </w:tcMar>
+            <w:shd w:fill="FAF7F2"/>
           </w:tcPr>
           <w:p>
-            <w:pPr>
-              <w:spacing w:before="40" w:after="40"/>
-            </w:pPr>
             <w:r>
               <w:rPr>
-                <w:rFonts w:ascii="Calibri" w:hAnsi="Calibri"/>
-                <w:color w:val="333333"/>
-                <w:sz w:val="18"/>
+                <w:rFonts w:ascii="Segoe UI" w:hAnsi="Segoe UI"/>
+                <w:color w:val="222222"/>
+                <w:sz w:val="17"/>
               </w:rPr>
               <w:t>+LKR 6,500</w:t>
             </w:r>
@@ -964,23 +944,21 @@
         </w:tc>
         <w:tc>
           <w:tcPr>
-            <w:tcW w:type="dxa" w:w="1560"/>
+            <w:tcW w:type="dxa" w:w="1608"/>
             <w:tcMar>
-              <w:top w:w="80" w:type="dxa"/>
-              <w:bottom w:w="80" w:type="dxa"/>
-              <w:left w:w="150" w:type="dxa"/>
-              <w:right w:w="150" w:type="dxa"/>
+              <w:top w:w="100" w:type="dxa"/>
+              <w:bottom w:w="100" w:type="dxa"/>
+              <w:left w:w="120" w:type="dxa"/>
+              <w:right w:w="120" w:type="dxa"/>
             </w:tcMar>
+            <w:shd w:fill="FAF7F2"/>
           </w:tcPr>
           <w:p>
-            <w:pPr>
-              <w:spacing w:before="40" w:after="40"/>
-            </w:pPr>
             <w:r>
               <w:rPr>
-                <w:rFonts w:ascii="Calibri" w:hAnsi="Calibri"/>
-                <w:color w:val="333333"/>
-                <w:sz w:val="18"/>
+                <w:rFonts w:ascii="Segoe UI" w:hAnsi="Segoe UI"/>
+                <w:color w:val="222222"/>
+                <w:sz w:val="17"/>
               </w:rPr>
               <w:t>Deployed on secure, production-grade Netlify subdomains for evaluation.</w:t>
             </w:r>
@@ -990,49 +968,41 @@
       <w:tr>
         <w:tc>
           <w:tcPr>
-            <w:tcW w:type="dxa" w:w="1560"/>
-            <w:shd w:fill="FBF8F9"/>
+            <w:tcW w:type="dxa" w:w="1608"/>
             <w:tcMar>
-              <w:top w:w="80" w:type="dxa"/>
-              <w:bottom w:w="80" w:type="dxa"/>
-              <w:left w:w="150" w:type="dxa"/>
-              <w:right w:w="150" w:type="dxa"/>
+              <w:top w:w="100" w:type="dxa"/>
+              <w:bottom w:w="100" w:type="dxa"/>
+              <w:left w:w="120" w:type="dxa"/>
+              <w:right w:w="120" w:type="dxa"/>
             </w:tcMar>
           </w:tcPr>
           <w:p>
-            <w:pPr>
-              <w:spacing w:before="40" w:after="40"/>
-            </w:pPr>
             <w:r>
               <w:rPr>
-                <w:rFonts w:ascii="Calibri" w:hAnsi="Calibri"/>
-                <w:color w:val="333333"/>
-                <w:sz w:val="18"/>
+                <w:rFonts w:ascii="Segoe UI" w:hAnsi="Segoe UI"/>
+                <w:color w:val="222222"/>
+                <w:sz w:val="17"/>
               </w:rPr>
-              <w:t>UI/UX Design Platform (Figma)</w:t>
+              <w:t>**UI/UX Design Platform (Figma)**</w:t>
             </w:r>
           </w:p>
         </w:tc>
         <w:tc>
           <w:tcPr>
-            <w:tcW w:type="dxa" w:w="1560"/>
-            <w:shd w:fill="FBF8F9"/>
+            <w:tcW w:type="dxa" w:w="1608"/>
             <w:tcMar>
-              <w:top w:w="80" w:type="dxa"/>
-              <w:bottom w:w="80" w:type="dxa"/>
-              <w:left w:w="150" w:type="dxa"/>
-              <w:right w:w="150" w:type="dxa"/>
+              <w:top w:w="100" w:type="dxa"/>
+              <w:bottom w:w="100" w:type="dxa"/>
+              <w:left w:w="120" w:type="dxa"/>
+              <w:right w:w="120" w:type="dxa"/>
             </w:tcMar>
           </w:tcPr>
           <w:p>
-            <w:pPr>
-              <w:spacing w:before="40" w:after="40"/>
-            </w:pPr>
             <w:r>
               <w:rPr>
-                <w:rFonts w:ascii="Calibri" w:hAnsi="Calibri"/>
-                <w:color w:val="333333"/>
-                <w:sz w:val="18"/>
+                <w:rFonts w:ascii="Segoe UI" w:hAnsi="Segoe UI"/>
+                <w:color w:val="222222"/>
+                <w:sz w:val="17"/>
               </w:rPr>
               <w:t>Collaborative wireframing, component library, and design tokens</w:t>
             </w:r>
@@ -1040,24 +1010,20 @@
         </w:tc>
         <w:tc>
           <w:tcPr>
-            <w:tcW w:type="dxa" w:w="1560"/>
-            <w:shd w:fill="FBF8F9"/>
+            <w:tcW w:type="dxa" w:w="1608"/>
             <w:tcMar>
-              <w:top w:w="80" w:type="dxa"/>
-              <w:bottom w:w="80" w:type="dxa"/>
-              <w:left w:w="150" w:type="dxa"/>
-              <w:right w:w="150" w:type="dxa"/>
+              <w:top w:w="100" w:type="dxa"/>
+              <w:bottom w:w="100" w:type="dxa"/>
+              <w:left w:w="120" w:type="dxa"/>
+              <w:right w:w="120" w:type="dxa"/>
             </w:tcMar>
           </w:tcPr>
           <w:p>
-            <w:pPr>
-              <w:spacing w:before="40" w:after="40"/>
-            </w:pPr>
             <w:r>
               <w:rPr>
-                <w:rFonts w:ascii="Calibri" w:hAnsi="Calibri"/>
-                <w:color w:val="333333"/>
-                <w:sz w:val="18"/>
+                <w:rFonts w:ascii="Segoe UI" w:hAnsi="Segoe UI"/>
+                <w:color w:val="222222"/>
+                <w:sz w:val="17"/>
               </w:rPr>
               <w:t>LKR 18,000</w:t>
             </w:r>
@@ -1065,24 +1031,20 @@
         </w:tc>
         <w:tc>
           <w:tcPr>
-            <w:tcW w:type="dxa" w:w="1560"/>
-            <w:shd w:fill="FBF8F9"/>
+            <w:tcW w:type="dxa" w:w="1608"/>
             <w:tcMar>
-              <w:top w:w="80" w:type="dxa"/>
-              <w:bottom w:w="80" w:type="dxa"/>
-              <w:left w:w="150" w:type="dxa"/>
-              <w:right w:w="150" w:type="dxa"/>
+              <w:top w:w="100" w:type="dxa"/>
+              <w:bottom w:w="100" w:type="dxa"/>
+              <w:left w:w="120" w:type="dxa"/>
+              <w:right w:w="120" w:type="dxa"/>
             </w:tcMar>
           </w:tcPr>
           <w:p>
-            <w:pPr>
-              <w:spacing w:before="40" w:after="40"/>
-            </w:pPr>
             <w:r>
               <w:rPr>
-                <w:rFonts w:ascii="Calibri" w:hAnsi="Calibri"/>
-                <w:color w:val="333333"/>
-                <w:sz w:val="18"/>
+                <w:rFonts w:ascii="Segoe UI" w:hAnsi="Segoe UI"/>
+                <w:color w:val="222222"/>
+                <w:sz w:val="17"/>
               </w:rPr>
               <w:t>LKR 0</w:t>
             </w:r>
@@ -1090,24 +1052,20 @@
         </w:tc>
         <w:tc>
           <w:tcPr>
-            <w:tcW w:type="dxa" w:w="1560"/>
-            <w:shd w:fill="FBF8F9"/>
+            <w:tcW w:type="dxa" w:w="1608"/>
             <w:tcMar>
-              <w:top w:w="80" w:type="dxa"/>
-              <w:bottom w:w="80" w:type="dxa"/>
-              <w:left w:w="150" w:type="dxa"/>
-              <w:right w:w="150" w:type="dxa"/>
+              <w:top w:w="100" w:type="dxa"/>
+              <w:bottom w:w="100" w:type="dxa"/>
+              <w:left w:w="120" w:type="dxa"/>
+              <w:right w:w="120" w:type="dxa"/>
             </w:tcMar>
           </w:tcPr>
           <w:p>
-            <w:pPr>
-              <w:spacing w:before="40" w:after="40"/>
-            </w:pPr>
             <w:r>
               <w:rPr>
-                <w:rFonts w:ascii="Calibri" w:hAnsi="Calibri"/>
-                <w:color w:val="333333"/>
-                <w:sz w:val="18"/>
+                <w:rFonts w:ascii="Segoe UI" w:hAnsi="Segoe UI"/>
+                <w:color w:val="222222"/>
+                <w:sz w:val="17"/>
               </w:rPr>
               <w:t>+LKR 18,000</w:t>
             </w:r>
@@ -1115,24 +1073,20 @@
         </w:tc>
         <w:tc>
           <w:tcPr>
-            <w:tcW w:type="dxa" w:w="1560"/>
-            <w:shd w:fill="FBF8F9"/>
+            <w:tcW w:type="dxa" w:w="1608"/>
             <w:tcMar>
-              <w:top w:w="80" w:type="dxa"/>
-              <w:bottom w:w="80" w:type="dxa"/>
-              <w:left w:w="150" w:type="dxa"/>
-              <w:right w:w="150" w:type="dxa"/>
+              <w:top w:w="100" w:type="dxa"/>
+              <w:bottom w:w="100" w:type="dxa"/>
+              <w:left w:w="120" w:type="dxa"/>
+              <w:right w:w="120" w:type="dxa"/>
             </w:tcMar>
           </w:tcPr>
           <w:p>
-            <w:pPr>
-              <w:spacing w:before="40" w:after="40"/>
-            </w:pPr>
             <w:r>
               <w:rPr>
-                <w:rFonts w:ascii="Calibri" w:hAnsi="Calibri"/>
-                <w:color w:val="333333"/>
-                <w:sz w:val="18"/>
+                <w:rFonts w:ascii="Segoe UI" w:hAnsi="Segoe UI"/>
+                <w:color w:val="222222"/>
+                <w:sz w:val="17"/>
               </w:rPr>
               <w:t>Figma Education Free Plan with full team sharing and view permissions.</w:t>
             </w:r>
@@ -1142,47 +1096,43 @@
       <w:tr>
         <w:tc>
           <w:tcPr>
-            <w:tcW w:type="dxa" w:w="1560"/>
+            <w:tcW w:type="dxa" w:w="1608"/>
             <w:tcMar>
-              <w:top w:w="80" w:type="dxa"/>
-              <w:bottom w:w="80" w:type="dxa"/>
-              <w:left w:w="150" w:type="dxa"/>
-              <w:right w:w="150" w:type="dxa"/>
+              <w:top w:w="100" w:type="dxa"/>
+              <w:bottom w:w="100" w:type="dxa"/>
+              <w:left w:w="120" w:type="dxa"/>
+              <w:right w:w="120" w:type="dxa"/>
             </w:tcMar>
+            <w:shd w:fill="FAF7F2"/>
           </w:tcPr>
           <w:p>
-            <w:pPr>
-              <w:spacing w:before="40" w:after="40"/>
-            </w:pPr>
             <w:r>
               <w:rPr>
-                <w:rFonts w:ascii="Calibri" w:hAnsi="Calibri"/>
-                <w:color w:val="333333"/>
-                <w:sz w:val="18"/>
+                <w:rFonts w:ascii="Segoe UI" w:hAnsi="Segoe UI"/>
+                <w:color w:val="222222"/>
+                <w:sz w:val="17"/>
               </w:rPr>
-              <w:t>Project Management Tool (Jira Cloud)</w:t>
+              <w:t>**Project Management Tool (Jira Cloud)**</w:t>
             </w:r>
           </w:p>
         </w:tc>
         <w:tc>
           <w:tcPr>
-            <w:tcW w:type="dxa" w:w="1560"/>
+            <w:tcW w:type="dxa" w:w="1608"/>
             <w:tcMar>
-              <w:top w:w="80" w:type="dxa"/>
-              <w:bottom w:w="80" w:type="dxa"/>
-              <w:left w:w="150" w:type="dxa"/>
-              <w:right w:w="150" w:type="dxa"/>
+              <w:top w:w="100" w:type="dxa"/>
+              <w:bottom w:w="100" w:type="dxa"/>
+              <w:left w:w="120" w:type="dxa"/>
+              <w:right w:w="120" w:type="dxa"/>
             </w:tcMar>
+            <w:shd w:fill="FAF7F2"/>
           </w:tcPr>
           <w:p>
-            <w:pPr>
-              <w:spacing w:before="40" w:after="40"/>
-            </w:pPr>
             <w:r>
               <w:rPr>
-                <w:rFonts w:ascii="Calibri" w:hAnsi="Calibri"/>
-                <w:color w:val="333333"/>
-                <w:sz w:val="18"/>
+                <w:rFonts w:ascii="Segoe UI" w:hAnsi="Segoe UI"/>
+                <w:color w:val="222222"/>
+                <w:sz w:val="17"/>
               </w:rPr>
               <w:t>Agile sprint tracking, Kanban board, WBS issue management</w:t>
             </w:r>
@@ -1190,23 +1140,21 @@
         </w:tc>
         <w:tc>
           <w:tcPr>
-            <w:tcW w:type="dxa" w:w="1560"/>
+            <w:tcW w:type="dxa" w:w="1608"/>
             <w:tcMar>
-              <w:top w:w="80" w:type="dxa"/>
-              <w:bottom w:w="80" w:type="dxa"/>
-              <w:left w:w="150" w:type="dxa"/>
-              <w:right w:w="150" w:type="dxa"/>
+              <w:top w:w="100" w:type="dxa"/>
+              <w:bottom w:w="100" w:type="dxa"/>
+              <w:left w:w="120" w:type="dxa"/>
+              <w:right w:w="120" w:type="dxa"/>
             </w:tcMar>
+            <w:shd w:fill="FAF7F2"/>
           </w:tcPr>
           <w:p>
-            <w:pPr>
-              <w:spacing w:before="40" w:after="40"/>
-            </w:pPr>
             <w:r>
               <w:rPr>
-                <w:rFonts w:ascii="Calibri" w:hAnsi="Calibri"/>
-                <w:color w:val="333333"/>
-                <w:sz w:val="18"/>
+                <w:rFonts w:ascii="Segoe UI" w:hAnsi="Segoe UI"/>
+                <w:color w:val="222222"/>
+                <w:sz w:val="17"/>
               </w:rPr>
               <w:t>LKR 20,000</w:t>
             </w:r>
@@ -1214,23 +1162,21 @@
         </w:tc>
         <w:tc>
           <w:tcPr>
-            <w:tcW w:type="dxa" w:w="1560"/>
+            <w:tcW w:type="dxa" w:w="1608"/>
             <w:tcMar>
-              <w:top w:w="80" w:type="dxa"/>
-              <w:bottom w:w="80" w:type="dxa"/>
-              <w:left w:w="150" w:type="dxa"/>
-              <w:right w:w="150" w:type="dxa"/>
+              <w:top w:w="100" w:type="dxa"/>
+              <w:bottom w:w="100" w:type="dxa"/>
+              <w:left w:w="120" w:type="dxa"/>
+              <w:right w:w="120" w:type="dxa"/>
             </w:tcMar>
+            <w:shd w:fill="FAF7F2"/>
           </w:tcPr>
           <w:p>
-            <w:pPr>
-              <w:spacing w:before="40" w:after="40"/>
-            </w:pPr>
             <w:r>
               <w:rPr>
-                <w:rFonts w:ascii="Calibri" w:hAnsi="Calibri"/>
-                <w:color w:val="333333"/>
-                <w:sz w:val="18"/>
+                <w:rFonts w:ascii="Segoe UI" w:hAnsi="Segoe UI"/>
+                <w:color w:val="222222"/>
+                <w:sz w:val="17"/>
               </w:rPr>
               <w:t>LKR 0</w:t>
             </w:r>
@@ -1238,23 +1184,21 @@
         </w:tc>
         <w:tc>
           <w:tcPr>
-            <w:tcW w:type="dxa" w:w="1560"/>
+            <w:tcW w:type="dxa" w:w="1608"/>
             <w:tcMar>
-              <w:top w:w="80" w:type="dxa"/>
-              <w:bottom w:w="80" w:type="dxa"/>
-              <w:left w:w="150" w:type="dxa"/>
-              <w:right w:w="150" w:type="dxa"/>
+              <w:top w:w="100" w:type="dxa"/>
+              <w:bottom w:w="100" w:type="dxa"/>
+              <w:left w:w="120" w:type="dxa"/>
+              <w:right w:w="120" w:type="dxa"/>
             </w:tcMar>
+            <w:shd w:fill="FAF7F2"/>
           </w:tcPr>
           <w:p>
-            <w:pPr>
-              <w:spacing w:before="40" w:after="40"/>
-            </w:pPr>
             <w:r>
               <w:rPr>
-                <w:rFonts w:ascii="Calibri" w:hAnsi="Calibri"/>
-                <w:color w:val="333333"/>
-                <w:sz w:val="18"/>
+                <w:rFonts w:ascii="Segoe UI" w:hAnsi="Segoe UI"/>
+                <w:color w:val="222222"/>
+                <w:sz w:val="17"/>
               </w:rPr>
               <w:t>+LKR 20,000</w:t>
             </w:r>
@@ -1262,23 +1206,21 @@
         </w:tc>
         <w:tc>
           <w:tcPr>
-            <w:tcW w:type="dxa" w:w="1560"/>
+            <w:tcW w:type="dxa" w:w="1608"/>
             <w:tcMar>
-              <w:top w:w="80" w:type="dxa"/>
-              <w:bottom w:w="80" w:type="dxa"/>
-              <w:left w:w="150" w:type="dxa"/>
-              <w:right w:w="150" w:type="dxa"/>
+              <w:top w:w="100" w:type="dxa"/>
+              <w:bottom w:w="100" w:type="dxa"/>
+              <w:left w:w="120" w:type="dxa"/>
+              <w:right w:w="120" w:type="dxa"/>
             </w:tcMar>
+            <w:shd w:fill="FAF7F2"/>
           </w:tcPr>
           <w:p>
-            <w:pPr>
-              <w:spacing w:before="40" w:after="40"/>
-            </w:pPr>
             <w:r>
               <w:rPr>
-                <w:rFonts w:ascii="Calibri" w:hAnsi="Calibri"/>
-                <w:color w:val="333333"/>
-                <w:sz w:val="18"/>
+                <w:rFonts w:ascii="Segoe UI" w:hAnsi="Segoe UI"/>
+                <w:color w:val="222222"/>
+                <w:sz w:val="17"/>
               </w:rPr>
               <w:t>Atlassian Jira Cloud Free Tier (up to 10 users).</w:t>
             </w:r>
@@ -1288,49 +1230,41 @@
       <w:tr>
         <w:tc>
           <w:tcPr>
-            <w:tcW w:type="dxa" w:w="1560"/>
-            <w:shd w:fill="FBF8F9"/>
+            <w:tcW w:type="dxa" w:w="1608"/>
             <w:tcMar>
-              <w:top w:w="80" w:type="dxa"/>
-              <w:bottom w:w="80" w:type="dxa"/>
-              <w:left w:w="150" w:type="dxa"/>
-              <w:right w:w="150" w:type="dxa"/>
+              <w:top w:w="100" w:type="dxa"/>
+              <w:bottom w:w="100" w:type="dxa"/>
+              <w:left w:w="120" w:type="dxa"/>
+              <w:right w:w="120" w:type="dxa"/>
             </w:tcMar>
           </w:tcPr>
           <w:p>
-            <w:pPr>
-              <w:spacing w:before="40" w:after="40"/>
-            </w:pPr>
             <w:r>
               <w:rPr>
-                <w:rFonts w:ascii="Calibri" w:hAnsi="Calibri"/>
-                <w:color w:val="333333"/>
-                <w:sz w:val="18"/>
+                <w:rFonts w:ascii="Segoe UI" w:hAnsi="Segoe UI"/>
+                <w:color w:val="222222"/>
+                <w:sz w:val="17"/>
               </w:rPr>
-              <w:t>Source Control &amp; CI/CD (GitHub)</w:t>
+              <w:t>**Source Control &amp; CI/CD (GitHub)**</w:t>
             </w:r>
           </w:p>
         </w:tc>
         <w:tc>
           <w:tcPr>
-            <w:tcW w:type="dxa" w:w="1560"/>
-            <w:shd w:fill="FBF8F9"/>
+            <w:tcW w:type="dxa" w:w="1608"/>
             <w:tcMar>
-              <w:top w:w="80" w:type="dxa"/>
-              <w:bottom w:w="80" w:type="dxa"/>
-              <w:left w:w="150" w:type="dxa"/>
-              <w:right w:w="150" w:type="dxa"/>
+              <w:top w:w="100" w:type="dxa"/>
+              <w:bottom w:w="100" w:type="dxa"/>
+              <w:left w:w="120" w:type="dxa"/>
+              <w:right w:w="120" w:type="dxa"/>
             </w:tcMar>
           </w:tcPr>
           <w:p>
-            <w:pPr>
-              <w:spacing w:before="40" w:after="40"/>
-            </w:pPr>
             <w:r>
               <w:rPr>
-                <w:rFonts w:ascii="Calibri" w:hAnsi="Calibri"/>
-                <w:color w:val="333333"/>
-                <w:sz w:val="18"/>
+                <w:rFonts w:ascii="Segoe UI" w:hAnsi="Segoe UI"/>
+                <w:color w:val="222222"/>
+                <w:sz w:val="17"/>
               </w:rPr>
               <w:t>Monorepo hosting, PR code reviews, and issue tracker</w:t>
             </w:r>
@@ -1338,24 +1272,20 @@
         </w:tc>
         <w:tc>
           <w:tcPr>
-            <w:tcW w:type="dxa" w:w="1560"/>
-            <w:shd w:fill="FBF8F9"/>
+            <w:tcW w:type="dxa" w:w="1608"/>
             <w:tcMar>
-              <w:top w:w="80" w:type="dxa"/>
-              <w:bottom w:w="80" w:type="dxa"/>
-              <w:left w:w="150" w:type="dxa"/>
-              <w:right w:w="150" w:type="dxa"/>
+              <w:top w:w="100" w:type="dxa"/>
+              <w:bottom w:w="100" w:type="dxa"/>
+              <w:left w:w="120" w:type="dxa"/>
+              <w:right w:w="120" w:type="dxa"/>
             </w:tcMar>
           </w:tcPr>
           <w:p>
-            <w:pPr>
-              <w:spacing w:before="40" w:after="40"/>
-            </w:pPr>
             <w:r>
               <w:rPr>
-                <w:rFonts w:ascii="Calibri" w:hAnsi="Calibri"/>
-                <w:color w:val="333333"/>
-                <w:sz w:val="18"/>
+                <w:rFonts w:ascii="Segoe UI" w:hAnsi="Segoe UI"/>
+                <w:color w:val="222222"/>
+                <w:sz w:val="17"/>
               </w:rPr>
               <w:t>LKR 12,000</w:t>
             </w:r>
@@ -1363,24 +1293,20 @@
         </w:tc>
         <w:tc>
           <w:tcPr>
-            <w:tcW w:type="dxa" w:w="1560"/>
-            <w:shd w:fill="FBF8F9"/>
+            <w:tcW w:type="dxa" w:w="1608"/>
             <w:tcMar>
-              <w:top w:w="80" w:type="dxa"/>
-              <w:bottom w:w="80" w:type="dxa"/>
-              <w:left w:w="150" w:type="dxa"/>
-              <w:right w:w="150" w:type="dxa"/>
+              <w:top w:w="100" w:type="dxa"/>
+              <w:bottom w:w="100" w:type="dxa"/>
+              <w:left w:w="120" w:type="dxa"/>
+              <w:right w:w="120" w:type="dxa"/>
             </w:tcMar>
           </w:tcPr>
           <w:p>
-            <w:pPr>
-              <w:spacing w:before="40" w:after="40"/>
-            </w:pPr>
             <w:r>
               <w:rPr>
-                <w:rFonts w:ascii="Calibri" w:hAnsi="Calibri"/>
-                <w:color w:val="333333"/>
-                <w:sz w:val="18"/>
+                <w:rFonts w:ascii="Segoe UI" w:hAnsi="Segoe UI"/>
+                <w:color w:val="222222"/>
+                <w:sz w:val="17"/>
               </w:rPr>
               <w:t>LKR 0</w:t>
             </w:r>
@@ -1388,24 +1314,20 @@
         </w:tc>
         <w:tc>
           <w:tcPr>
-            <w:tcW w:type="dxa" w:w="1560"/>
-            <w:shd w:fill="FBF8F9"/>
+            <w:tcW w:type="dxa" w:w="1608"/>
             <w:tcMar>
-              <w:top w:w="80" w:type="dxa"/>
-              <w:bottom w:w="80" w:type="dxa"/>
-              <w:left w:w="150" w:type="dxa"/>
-              <w:right w:w="150" w:type="dxa"/>
+              <w:top w:w="100" w:type="dxa"/>
+              <w:bottom w:w="100" w:type="dxa"/>
+              <w:left w:w="120" w:type="dxa"/>
+              <w:right w:w="120" w:type="dxa"/>
             </w:tcMar>
           </w:tcPr>
           <w:p>
-            <w:pPr>
-              <w:spacing w:before="40" w:after="40"/>
-            </w:pPr>
             <w:r>
               <w:rPr>
-                <w:rFonts w:ascii="Calibri" w:hAnsi="Calibri"/>
-                <w:color w:val="333333"/>
-                <w:sz w:val="18"/>
+                <w:rFonts w:ascii="Segoe UI" w:hAnsi="Segoe UI"/>
+                <w:color w:val="222222"/>
+                <w:sz w:val="17"/>
               </w:rPr>
               <w:t>+LKR 12,000</w:t>
             </w:r>
@@ -1413,24 +1335,20 @@
         </w:tc>
         <w:tc>
           <w:tcPr>
-            <w:tcW w:type="dxa" w:w="1560"/>
-            <w:shd w:fill="FBF8F9"/>
+            <w:tcW w:type="dxa" w:w="1608"/>
             <w:tcMar>
-              <w:top w:w="80" w:type="dxa"/>
-              <w:bottom w:w="80" w:type="dxa"/>
-              <w:left w:w="150" w:type="dxa"/>
-              <w:right w:w="150" w:type="dxa"/>
+              <w:top w:w="100" w:type="dxa"/>
+              <w:bottom w:w="100" w:type="dxa"/>
+              <w:left w:w="120" w:type="dxa"/>
+              <w:right w:w="120" w:type="dxa"/>
             </w:tcMar>
           </w:tcPr>
           <w:p>
-            <w:pPr>
-              <w:spacing w:before="40" w:after="40"/>
-            </w:pPr>
             <w:r>
               <w:rPr>
-                <w:rFonts w:ascii="Calibri" w:hAnsi="Calibri"/>
-                <w:color w:val="333333"/>
-                <w:sz w:val="18"/>
+                <w:rFonts w:ascii="Segoe UI" w:hAnsi="Segoe UI"/>
+                <w:color w:val="222222"/>
+                <w:sz w:val="17"/>
               </w:rPr>
               <w:t>GitHub Academic Free Tier with automated GitHub Actions.</w:t>
             </w:r>
@@ -1440,47 +1358,43 @@
       <w:tr>
         <w:tc>
           <w:tcPr>
-            <w:tcW w:type="dxa" w:w="1560"/>
+            <w:tcW w:type="dxa" w:w="1608"/>
             <w:tcMar>
-              <w:top w:w="80" w:type="dxa"/>
-              <w:bottom w:w="80" w:type="dxa"/>
-              <w:left w:w="150" w:type="dxa"/>
-              <w:right w:w="150" w:type="dxa"/>
+              <w:top w:w="100" w:type="dxa"/>
+              <w:bottom w:w="100" w:type="dxa"/>
+              <w:left w:w="120" w:type="dxa"/>
+              <w:right w:w="120" w:type="dxa"/>
             </w:tcMar>
+            <w:shd w:fill="FAF7F2"/>
           </w:tcPr>
           <w:p>
-            <w:pPr>
-              <w:spacing w:before="40" w:after="40"/>
-            </w:pPr>
             <w:r>
               <w:rPr>
-                <w:rFonts w:ascii="Calibri" w:hAnsi="Calibri"/>
-                <w:color w:val="333333"/>
-                <w:sz w:val="18"/>
+                <w:rFonts w:ascii="Segoe UI" w:hAnsi="Segoe UI"/>
+                <w:color w:val="222222"/>
+                <w:sz w:val="17"/>
               </w:rPr>
-              <w:t>Hardware Workstations</w:t>
+              <w:t>**Hardware Workstations**</w:t>
             </w:r>
           </w:p>
         </w:tc>
         <w:tc>
           <w:tcPr>
-            <w:tcW w:type="dxa" w:w="1560"/>
+            <w:tcW w:type="dxa" w:w="1608"/>
             <w:tcMar>
-              <w:top w:w="80" w:type="dxa"/>
-              <w:bottom w:w="80" w:type="dxa"/>
-              <w:left w:w="150" w:type="dxa"/>
-              <w:right w:w="150" w:type="dxa"/>
+              <w:top w:w="100" w:type="dxa"/>
+              <w:bottom w:w="100" w:type="dxa"/>
+              <w:left w:w="120" w:type="dxa"/>
+              <w:right w:w="120" w:type="dxa"/>
             </w:tcMar>
+            <w:shd w:fill="FAF7F2"/>
           </w:tcPr>
           <w:p>
-            <w:pPr>
-              <w:spacing w:before="40" w:after="40"/>
-            </w:pPr>
             <w:r>
               <w:rPr>
-                <w:rFonts w:ascii="Calibri" w:hAnsi="Calibri"/>
-                <w:color w:val="333333"/>
-                <w:sz w:val="18"/>
+                <w:rFonts w:ascii="Segoe UI" w:hAnsi="Segoe UI"/>
+                <w:color w:val="222222"/>
+                <w:sz w:val="17"/>
               </w:rPr>
               <w:t>5 Developer laptops (Intel Core i5/i7, 16GB RAM)</w:t>
             </w:r>
@@ -1488,23 +1402,21 @@
         </w:tc>
         <w:tc>
           <w:tcPr>
-            <w:tcW w:type="dxa" w:w="1560"/>
+            <w:tcW w:type="dxa" w:w="1608"/>
             <w:tcMar>
-              <w:top w:w="80" w:type="dxa"/>
-              <w:bottom w:w="80" w:type="dxa"/>
-              <w:left w:w="150" w:type="dxa"/>
-              <w:right w:w="150" w:type="dxa"/>
+              <w:top w:w="100" w:type="dxa"/>
+              <w:bottom w:w="100" w:type="dxa"/>
+              <w:left w:w="120" w:type="dxa"/>
+              <w:right w:w="120" w:type="dxa"/>
             </w:tcMar>
+            <w:shd w:fill="FAF7F2"/>
           </w:tcPr>
           <w:p>
-            <w:pPr>
-              <w:spacing w:before="40" w:after="40"/>
-            </w:pPr>
             <w:r>
               <w:rPr>
-                <w:rFonts w:ascii="Calibri" w:hAnsi="Calibri"/>
-                <w:color w:val="333333"/>
-                <w:sz w:val="18"/>
+                <w:rFonts w:ascii="Segoe UI" w:hAnsi="Segoe UI"/>
+                <w:color w:val="222222"/>
+                <w:sz w:val="17"/>
               </w:rPr>
               <w:t>LKR 0</w:t>
             </w:r>
@@ -1512,23 +1424,21 @@
         </w:tc>
         <w:tc>
           <w:tcPr>
-            <w:tcW w:type="dxa" w:w="1560"/>
+            <w:tcW w:type="dxa" w:w="1608"/>
             <w:tcMar>
-              <w:top w:w="80" w:type="dxa"/>
-              <w:bottom w:w="80" w:type="dxa"/>
-              <w:left w:w="150" w:type="dxa"/>
-              <w:right w:w="150" w:type="dxa"/>
+              <w:top w:w="100" w:type="dxa"/>
+              <w:bottom w:w="100" w:type="dxa"/>
+              <w:left w:w="120" w:type="dxa"/>
+              <w:right w:w="120" w:type="dxa"/>
             </w:tcMar>
+            <w:shd w:fill="FAF7F2"/>
           </w:tcPr>
           <w:p>
-            <w:pPr>
-              <w:spacing w:before="40" w:after="40"/>
-            </w:pPr>
             <w:r>
               <w:rPr>
-                <w:rFonts w:ascii="Calibri" w:hAnsi="Calibri"/>
-                <w:color w:val="333333"/>
-                <w:sz w:val="18"/>
+                <w:rFonts w:ascii="Segoe UI" w:hAnsi="Segoe UI"/>
+                <w:color w:val="222222"/>
+                <w:sz w:val="17"/>
               </w:rPr>
               <w:t>LKR 0</w:t>
             </w:r>
@@ -1536,23 +1446,21 @@
         </w:tc>
         <w:tc>
           <w:tcPr>
-            <w:tcW w:type="dxa" w:w="1560"/>
+            <w:tcW w:type="dxa" w:w="1608"/>
             <w:tcMar>
-              <w:top w:w="80" w:type="dxa"/>
-              <w:bottom w:w="80" w:type="dxa"/>
-              <w:left w:w="150" w:type="dxa"/>
-              <w:right w:w="150" w:type="dxa"/>
+              <w:top w:w="100" w:type="dxa"/>
+              <w:bottom w:w="100" w:type="dxa"/>
+              <w:left w:w="120" w:type="dxa"/>
+              <w:right w:w="120" w:type="dxa"/>
             </w:tcMar>
+            <w:shd w:fill="FAF7F2"/>
           </w:tcPr>
           <w:p>
-            <w:pPr>
-              <w:spacing w:before="40" w:after="40"/>
-            </w:pPr>
             <w:r>
               <w:rPr>
-                <w:rFonts w:ascii="Calibri" w:hAnsi="Calibri"/>
-                <w:color w:val="333333"/>
-                <w:sz w:val="18"/>
+                <w:rFonts w:ascii="Segoe UI" w:hAnsi="Segoe UI"/>
+                <w:color w:val="222222"/>
+                <w:sz w:val="17"/>
               </w:rPr>
               <w:t>LKR 0</w:t>
             </w:r>
@@ -1560,23 +1468,21 @@
         </w:tc>
         <w:tc>
           <w:tcPr>
-            <w:tcW w:type="dxa" w:w="1560"/>
+            <w:tcW w:type="dxa" w:w="1608"/>
             <w:tcMar>
-              <w:top w:w="80" w:type="dxa"/>
-              <w:bottom w:w="80" w:type="dxa"/>
-              <w:left w:w="150" w:type="dxa"/>
-              <w:right w:w="150" w:type="dxa"/>
+              <w:top w:w="100" w:type="dxa"/>
+              <w:bottom w:w="100" w:type="dxa"/>
+              <w:left w:w="120" w:type="dxa"/>
+              <w:right w:w="120" w:type="dxa"/>
             </w:tcMar>
+            <w:shd w:fill="FAF7F2"/>
           </w:tcPr>
           <w:p>
-            <w:pPr>
-              <w:spacing w:before="40" w:after="40"/>
-            </w:pPr>
             <w:r>
               <w:rPr>
-                <w:rFonts w:ascii="Calibri" w:hAnsi="Calibri"/>
-                <w:color w:val="333333"/>
-                <w:sz w:val="18"/>
+                <w:rFonts w:ascii="Segoe UI" w:hAnsi="Segoe UI"/>
+                <w:color w:val="222222"/>
+                <w:sz w:val="17"/>
               </w:rPr>
               <w:t>Existing personal student computing hardware; zero incremental CAPEX.</w:t>
             </w:r>
@@ -1586,151 +1492,127 @@
       <w:tr>
         <w:tc>
           <w:tcPr>
-            <w:tcW w:type="dxa" w:w="1560"/>
-            <w:shd w:fill="FBF8F9"/>
+            <w:tcW w:type="dxa" w:w="1608"/>
             <w:tcMar>
-              <w:top w:w="80" w:type="dxa"/>
-              <w:bottom w:w="80" w:type="dxa"/>
-              <w:left w:w="150" w:type="dxa"/>
-              <w:right w:w="150" w:type="dxa"/>
+              <w:top w:w="100" w:type="dxa"/>
+              <w:bottom w:w="100" w:type="dxa"/>
+              <w:left w:w="120" w:type="dxa"/>
+              <w:right w:w="120" w:type="dxa"/>
             </w:tcMar>
           </w:tcPr>
           <w:p>
-            <w:pPr>
-              <w:spacing w:before="40" w:after="40"/>
-            </w:pPr>
             <w:r>
               <w:rPr>
-                <w:rFonts w:ascii="Calibri" w:hAnsi="Calibri"/>
-                <w:color w:val="333333"/>
-                <w:sz w:val="18"/>
+                <w:rFonts w:ascii="Segoe UI" w:hAnsi="Segoe UI"/>
+                <w:color w:val="222222"/>
+                <w:sz w:val="17"/>
               </w:rPr>
-              <w:t>TOTAL PROJECT BUDGET</w:t>
+              <w:t>**TOTAL PROJECT BUDGET**</w:t>
             </w:r>
           </w:p>
         </w:tc>
         <w:tc>
           <w:tcPr>
-            <w:tcW w:type="dxa" w:w="1560"/>
-            <w:shd w:fill="FBF8F9"/>
+            <w:tcW w:type="dxa" w:w="1608"/>
             <w:tcMar>
-              <w:top w:w="80" w:type="dxa"/>
-              <w:bottom w:w="80" w:type="dxa"/>
-              <w:left w:w="150" w:type="dxa"/>
-              <w:right w:w="150" w:type="dxa"/>
+              <w:top w:w="100" w:type="dxa"/>
+              <w:bottom w:w="100" w:type="dxa"/>
+              <w:left w:w="120" w:type="dxa"/>
+              <w:right w:w="120" w:type="dxa"/>
             </w:tcMar>
           </w:tcPr>
           <w:p>
-            <w:pPr>
-              <w:spacing w:before="40" w:after="40"/>
-            </w:pPr>
             <w:r>
               <w:rPr>
-                <w:rFonts w:ascii="Calibri" w:hAnsi="Calibri"/>
-                <w:color w:val="333333"/>
-                <w:sz w:val="18"/>
+                <w:rFonts w:ascii="Segoe UI" w:hAnsi="Segoe UI"/>
+                <w:color w:val="222222"/>
+                <w:sz w:val="17"/>
               </w:rPr>
-              <w:t>Comprehensive Full-Stack Development Budget</w:t>
+              <w:t>**Comprehensive Full-Stack Development Budget**</w:t>
             </w:r>
           </w:p>
         </w:tc>
         <w:tc>
           <w:tcPr>
-            <w:tcW w:type="dxa" w:w="1560"/>
-            <w:shd w:fill="FBF8F9"/>
+            <w:tcW w:type="dxa" w:w="1608"/>
             <w:tcMar>
-              <w:top w:w="80" w:type="dxa"/>
-              <w:bottom w:w="80" w:type="dxa"/>
-              <w:left w:w="150" w:type="dxa"/>
-              <w:right w:w="150" w:type="dxa"/>
+              <w:top w:w="100" w:type="dxa"/>
+              <w:bottom w:w="100" w:type="dxa"/>
+              <w:left w:w="120" w:type="dxa"/>
+              <w:right w:w="120" w:type="dxa"/>
             </w:tcMar>
           </w:tcPr>
           <w:p>
-            <w:pPr>
-              <w:spacing w:before="40" w:after="40"/>
-            </w:pPr>
             <w:r>
               <w:rPr>
-                <w:rFonts w:ascii="Calibri" w:hAnsi="Calibri"/>
-                <w:color w:val="333333"/>
-                <w:sz w:val="18"/>
+                <w:rFonts w:ascii="Segoe UI" w:hAnsi="Segoe UI"/>
+                <w:color w:val="222222"/>
+                <w:sz w:val="17"/>
               </w:rPr>
-              <w:t>LKR 861,500</w:t>
+              <w:t>**LKR 861,500**</w:t>
             </w:r>
           </w:p>
         </w:tc>
         <w:tc>
           <w:tcPr>
-            <w:tcW w:type="dxa" w:w="1560"/>
-            <w:shd w:fill="FBF8F9"/>
+            <w:tcW w:type="dxa" w:w="1608"/>
             <w:tcMar>
-              <w:top w:w="80" w:type="dxa"/>
-              <w:bottom w:w="80" w:type="dxa"/>
-              <w:left w:w="150" w:type="dxa"/>
-              <w:right w:w="150" w:type="dxa"/>
+              <w:top w:w="100" w:type="dxa"/>
+              <w:bottom w:w="100" w:type="dxa"/>
+              <w:left w:w="120" w:type="dxa"/>
+              <w:right w:w="120" w:type="dxa"/>
             </w:tcMar>
           </w:tcPr>
           <w:p>
-            <w:pPr>
-              <w:spacing w:before="40" w:after="40"/>
-            </w:pPr>
             <w:r>
               <w:rPr>
-                <w:rFonts w:ascii="Calibri" w:hAnsi="Calibri"/>
-                <w:color w:val="333333"/>
-                <w:sz w:val="18"/>
+                <w:rFonts w:ascii="Segoe UI" w:hAnsi="Segoe UI"/>
+                <w:color w:val="222222"/>
+                <w:sz w:val="17"/>
               </w:rPr>
-              <w:t>LKR 720,000</w:t>
+              <w:t>**LKR 720,000**</w:t>
             </w:r>
           </w:p>
         </w:tc>
         <w:tc>
           <w:tcPr>
-            <w:tcW w:type="dxa" w:w="1560"/>
-            <w:shd w:fill="FBF8F9"/>
+            <w:tcW w:type="dxa" w:w="1608"/>
             <w:tcMar>
-              <w:top w:w="80" w:type="dxa"/>
-              <w:bottom w:w="80" w:type="dxa"/>
-              <w:left w:w="150" w:type="dxa"/>
-              <w:right w:w="150" w:type="dxa"/>
+              <w:top w:w="100" w:type="dxa"/>
+              <w:bottom w:w="100" w:type="dxa"/>
+              <w:left w:w="120" w:type="dxa"/>
+              <w:right w:w="120" w:type="dxa"/>
             </w:tcMar>
           </w:tcPr>
           <w:p>
-            <w:pPr>
-              <w:spacing w:before="40" w:after="40"/>
-            </w:pPr>
             <w:r>
               <w:rPr>
-                <w:rFonts w:ascii="Calibri" w:hAnsi="Calibri"/>
-                <w:color w:val="333333"/>
-                <w:sz w:val="18"/>
+                <w:rFonts w:ascii="Segoe UI" w:hAnsi="Segoe UI"/>
+                <w:color w:val="222222"/>
+                <w:sz w:val="17"/>
               </w:rPr>
-              <w:t>+LKR 141,500 (16.4% Savings)</w:t>
+              <w:t>**+LKR 141,500 (16.4% Savings)**</w:t>
             </w:r>
           </w:p>
         </w:tc>
         <w:tc>
           <w:tcPr>
-            <w:tcW w:type="dxa" w:w="1560"/>
-            <w:shd w:fill="FBF8F9"/>
+            <w:tcW w:type="dxa" w:w="1608"/>
             <w:tcMar>
-              <w:top w:w="80" w:type="dxa"/>
-              <w:bottom w:w="80" w:type="dxa"/>
-              <w:left w:w="150" w:type="dxa"/>
-              <w:right w:w="150" w:type="dxa"/>
+              <w:top w:w="100" w:type="dxa"/>
+              <w:bottom w:w="100" w:type="dxa"/>
+              <w:left w:w="120" w:type="dxa"/>
+              <w:right w:w="120" w:type="dxa"/>
             </w:tcMar>
           </w:tcPr>
           <w:p>
-            <w:pPr>
-              <w:spacing w:before="40" w:after="40"/>
-            </w:pPr>
             <w:r>
               <w:rPr>
-                <w:rFonts w:ascii="Calibri" w:hAnsi="Calibri"/>
-                <w:color w:val="333333"/>
-                <w:sz w:val="18"/>
+                <w:rFonts w:ascii="Segoe UI" w:hAnsi="Segoe UI"/>
+                <w:color w:val="222222"/>
+                <w:sz w:val="17"/>
               </w:rPr>
-              <w:t>Lean Free-Tier Cloud Architecture &amp; Zero-Cost Tool Optimization</w:t>
+              <w:t>**Lean Free-Tier Cloud Architecture &amp; Zero-Cost Tool Optimization**</w:t>
             </w:r>
           </w:p>
         </w:tc>
@@ -1743,28 +1625,25 @@
     </w:p>
     <w:p>
       <w:pPr>
-        <w:spacing w:before="40" w:after="80"/>
+        <w:spacing w:before="120" w:after="120"/>
       </w:pPr>
       <w:r>
         <w:rPr>
-          <w:rFonts w:ascii="Calibri" w:hAnsi="Calibri"/>
-          <w:color w:val="222222"/>
-          <w:sz w:val="20"/>
+          <w:color w:val="EEDDE0"/>
         </w:rPr>
-        <w:t>---</w:t>
+        <w:t>__________________________________________________________________________</w:t>
       </w:r>
     </w:p>
     <w:p>
       <w:pPr>
-        <w:pStyle w:val="Heading2"/>
-        <w:spacing w:before="200" w:after="80"/>
+        <w:spacing w:before="240" w:after="80"/>
       </w:pPr>
       <w:r>
         <w:rPr>
-          <w:rFonts w:ascii="Georgia" w:hAnsi="Georgia"/>
+          <w:rFonts w:ascii="Playfair Display" w:hAnsi="Playfair Display"/>
           <w:b/>
           <w:color w:val="721F3A"/>
-          <w:sz w:val="28"/>
+          <w:sz w:val="30"/>
         </w:rPr>
         <w:t>3. Human Resource Effort Breakdown by Role</w:t>
       </w:r>
@@ -1776,34 +1655,31 @@
         <w:tblLook w:firstColumn="1" w:firstRow="1" w:lastColumn="0" w:lastRow="0" w:noHBand="0" w:noVBand="1" w:val="04A0"/>
       </w:tblPr>
       <w:tblGrid>
-        <w:gridCol w:w="1872"/>
-        <w:gridCol w:w="1872"/>
-        <w:gridCol w:w="1872"/>
-        <w:gridCol w:w="1872"/>
-        <w:gridCol w:w="1872"/>
+        <w:gridCol w:w="1930"/>
+        <w:gridCol w:w="1930"/>
+        <w:gridCol w:w="1930"/>
+        <w:gridCol w:w="1930"/>
+        <w:gridCol w:w="1930"/>
       </w:tblGrid>
       <w:tr>
         <w:tc>
           <w:tcPr>
-            <w:tcW w:type="dxa" w:w="1872"/>
+            <w:tcW w:type="dxa" w:w="1930"/>
+            <w:tcMar>
+              <w:top w:w="100" w:type="dxa"/>
+              <w:bottom w:w="100" w:type="dxa"/>
+              <w:left w:w="120" w:type="dxa"/>
+              <w:right w:w="120" w:type="dxa"/>
+            </w:tcMar>
             <w:shd w:fill="721F3A"/>
-            <w:tcMar>
-              <w:top w:w="120" w:type="dxa"/>
-              <w:bottom w:w="120" w:type="dxa"/>
-              <w:left w:w="150" w:type="dxa"/>
-              <w:right w:w="150" w:type="dxa"/>
-            </w:tcMar>
           </w:tcPr>
           <w:p>
-            <w:pPr>
-              <w:spacing w:before="40" w:after="40"/>
-            </w:pPr>
             <w:r>
               <w:rPr>
-                <w:rFonts w:ascii="Calibri" w:hAnsi="Calibri"/>
+                <w:rFonts w:ascii="Segoe UI" w:hAnsi="Segoe UI"/>
                 <w:b/>
                 <w:color w:val="FFFFFF"/>
-                <w:sz w:val="19"/>
+                <w:sz w:val="18"/>
               </w:rPr>
               <w:t>Team Member</w:t>
             </w:r>
@@ -1811,25 +1687,22 @@
         </w:tc>
         <w:tc>
           <w:tcPr>
-            <w:tcW w:type="dxa" w:w="1872"/>
+            <w:tcW w:type="dxa" w:w="1930"/>
+            <w:tcMar>
+              <w:top w:w="100" w:type="dxa"/>
+              <w:bottom w:w="100" w:type="dxa"/>
+              <w:left w:w="120" w:type="dxa"/>
+              <w:right w:w="120" w:type="dxa"/>
+            </w:tcMar>
             <w:shd w:fill="721F3A"/>
-            <w:tcMar>
-              <w:top w:w="120" w:type="dxa"/>
-              <w:bottom w:w="120" w:type="dxa"/>
-              <w:left w:w="150" w:type="dxa"/>
-              <w:right w:w="150" w:type="dxa"/>
-            </w:tcMar>
           </w:tcPr>
           <w:p>
-            <w:pPr>
-              <w:spacing w:before="40" w:after="40"/>
-            </w:pPr>
             <w:r>
               <w:rPr>
-                <w:rFonts w:ascii="Calibri" w:hAnsi="Calibri"/>
+                <w:rFonts w:ascii="Segoe UI" w:hAnsi="Segoe UI"/>
                 <w:b/>
                 <w:color w:val="FFFFFF"/>
-                <w:sz w:val="19"/>
+                <w:sz w:val="18"/>
               </w:rPr>
               <w:t>SDLC Role</w:t>
             </w:r>
@@ -1837,25 +1710,22 @@
         </w:tc>
         <w:tc>
           <w:tcPr>
-            <w:tcW w:type="dxa" w:w="1872"/>
+            <w:tcW w:type="dxa" w:w="1930"/>
+            <w:tcMar>
+              <w:top w:w="100" w:type="dxa"/>
+              <w:bottom w:w="100" w:type="dxa"/>
+              <w:left w:w="120" w:type="dxa"/>
+              <w:right w:w="120" w:type="dxa"/>
+            </w:tcMar>
             <w:shd w:fill="721F3A"/>
-            <w:tcMar>
-              <w:top w:w="120" w:type="dxa"/>
-              <w:bottom w:w="120" w:type="dxa"/>
-              <w:left w:w="150" w:type="dxa"/>
-              <w:right w:w="150" w:type="dxa"/>
-            </w:tcMar>
           </w:tcPr>
           <w:p>
-            <w:pPr>
-              <w:spacing w:before="40" w:after="40"/>
-            </w:pPr>
             <w:r>
               <w:rPr>
-                <w:rFonts w:ascii="Calibri" w:hAnsi="Calibri"/>
+                <w:rFonts w:ascii="Segoe UI" w:hAnsi="Segoe UI"/>
                 <w:b/>
                 <w:color w:val="FFFFFF"/>
-                <w:sz w:val="19"/>
+                <w:sz w:val="18"/>
               </w:rPr>
               <w:t>Estimated Effort</w:t>
             </w:r>
@@ -1863,25 +1733,22 @@
         </w:tc>
         <w:tc>
           <w:tcPr>
-            <w:tcW w:type="dxa" w:w="1872"/>
+            <w:tcW w:type="dxa" w:w="1930"/>
+            <w:tcMar>
+              <w:top w:w="100" w:type="dxa"/>
+              <w:bottom w:w="100" w:type="dxa"/>
+              <w:left w:w="120" w:type="dxa"/>
+              <w:right w:w="120" w:type="dxa"/>
+            </w:tcMar>
             <w:shd w:fill="721F3A"/>
-            <w:tcMar>
-              <w:top w:w="120" w:type="dxa"/>
-              <w:bottom w:w="120" w:type="dxa"/>
-              <w:left w:w="150" w:type="dxa"/>
-              <w:right w:w="150" w:type="dxa"/>
-            </w:tcMar>
           </w:tcPr>
           <w:p>
-            <w:pPr>
-              <w:spacing w:before="40" w:after="40"/>
-            </w:pPr>
             <w:r>
               <w:rPr>
-                <w:rFonts w:ascii="Calibri" w:hAnsi="Calibri"/>
+                <w:rFonts w:ascii="Segoe UI" w:hAnsi="Segoe UI"/>
                 <w:b/>
                 <w:color w:val="FFFFFF"/>
-                <w:sz w:val="19"/>
+                <w:sz w:val="18"/>
               </w:rPr>
               <w:t>Rate (LKR/hr)</w:t>
             </w:r>
@@ -1889,25 +1756,22 @@
         </w:tc>
         <w:tc>
           <w:tcPr>
-            <w:tcW w:type="dxa" w:w="1872"/>
+            <w:tcW w:type="dxa" w:w="1930"/>
+            <w:tcMar>
+              <w:top w:w="100" w:type="dxa"/>
+              <w:bottom w:w="100" w:type="dxa"/>
+              <w:left w:w="120" w:type="dxa"/>
+              <w:right w:w="120" w:type="dxa"/>
+            </w:tcMar>
             <w:shd w:fill="721F3A"/>
-            <w:tcMar>
-              <w:top w:w="120" w:type="dxa"/>
-              <w:bottom w:w="120" w:type="dxa"/>
-              <w:left w:w="150" w:type="dxa"/>
-              <w:right w:w="150" w:type="dxa"/>
-            </w:tcMar>
           </w:tcPr>
           <w:p>
-            <w:pPr>
-              <w:spacing w:before="40" w:after="40"/>
-            </w:pPr>
             <w:r>
               <w:rPr>
-                <w:rFonts w:ascii="Calibri" w:hAnsi="Calibri"/>
+                <w:rFonts w:ascii="Segoe UI" w:hAnsi="Segoe UI"/>
                 <w:b/>
                 <w:color w:val="FFFFFF"/>
-                <w:sz w:val="19"/>
+                <w:sz w:val="18"/>
               </w:rPr>
               <w:t>Total Human Resource Cost</w:t>
             </w:r>
@@ -1917,47 +1781,43 @@
       <w:tr>
         <w:tc>
           <w:tcPr>
-            <w:tcW w:type="dxa" w:w="1872"/>
+            <w:tcW w:type="dxa" w:w="1930"/>
             <w:tcMar>
-              <w:top w:w="80" w:type="dxa"/>
-              <w:bottom w:w="80" w:type="dxa"/>
-              <w:left w:w="150" w:type="dxa"/>
-              <w:right w:w="150" w:type="dxa"/>
+              <w:top w:w="100" w:type="dxa"/>
+              <w:bottom w:w="100" w:type="dxa"/>
+              <w:left w:w="120" w:type="dxa"/>
+              <w:right w:w="120" w:type="dxa"/>
             </w:tcMar>
+            <w:shd w:fill="FAF7F2"/>
           </w:tcPr>
           <w:p>
-            <w:pPr>
-              <w:spacing w:before="40" w:after="40"/>
-            </w:pPr>
             <w:r>
               <w:rPr>
-                <w:rFonts w:ascii="Calibri" w:hAnsi="Calibri"/>
-                <w:color w:val="333333"/>
-                <w:sz w:val="18"/>
+                <w:rFonts w:ascii="Segoe UI" w:hAnsi="Segoe UI"/>
+                <w:color w:val="222222"/>
+                <w:sz w:val="17"/>
               </w:rPr>
-              <w:t>M.S. Ranasinghe</w:t>
+              <w:t>**M.S. Ranasinghe**</w:t>
             </w:r>
           </w:p>
         </w:tc>
         <w:tc>
           <w:tcPr>
-            <w:tcW w:type="dxa" w:w="1872"/>
+            <w:tcW w:type="dxa" w:w="1930"/>
             <w:tcMar>
-              <w:top w:w="80" w:type="dxa"/>
-              <w:bottom w:w="80" w:type="dxa"/>
-              <w:left w:w="150" w:type="dxa"/>
-              <w:right w:w="150" w:type="dxa"/>
+              <w:top w:w="100" w:type="dxa"/>
+              <w:bottom w:w="100" w:type="dxa"/>
+              <w:left w:w="120" w:type="dxa"/>
+              <w:right w:w="120" w:type="dxa"/>
             </w:tcMar>
+            <w:shd w:fill="FAF7F2"/>
           </w:tcPr>
           <w:p>
-            <w:pPr>
-              <w:spacing w:before="40" w:after="40"/>
-            </w:pPr>
             <w:r>
               <w:rPr>
-                <w:rFonts w:ascii="Calibri" w:hAnsi="Calibri"/>
-                <w:color w:val="333333"/>
-                <w:sz w:val="18"/>
+                <w:rFonts w:ascii="Segoe UI" w:hAnsi="Segoe UI"/>
+                <w:color w:val="222222"/>
+                <w:sz w:val="17"/>
               </w:rPr>
               <w:t>Project Manager &amp; Full-Stack / DevOps</w:t>
             </w:r>
@@ -1965,23 +1825,21 @@
         </w:tc>
         <w:tc>
           <w:tcPr>
-            <w:tcW w:type="dxa" w:w="1872"/>
+            <w:tcW w:type="dxa" w:w="1930"/>
             <w:tcMar>
-              <w:top w:w="80" w:type="dxa"/>
-              <w:bottom w:w="80" w:type="dxa"/>
-              <w:left w:w="150" w:type="dxa"/>
-              <w:right w:w="150" w:type="dxa"/>
+              <w:top w:w="100" w:type="dxa"/>
+              <w:bottom w:w="100" w:type="dxa"/>
+              <w:left w:w="120" w:type="dxa"/>
+              <w:right w:w="120" w:type="dxa"/>
             </w:tcMar>
+            <w:shd w:fill="FAF7F2"/>
           </w:tcPr>
           <w:p>
-            <w:pPr>
-              <w:spacing w:before="40" w:after="40"/>
-            </w:pPr>
             <w:r>
               <w:rPr>
-                <w:rFonts w:ascii="Calibri" w:hAnsi="Calibri"/>
-                <w:color w:val="333333"/>
-                <w:sz w:val="18"/>
+                <w:rFonts w:ascii="Segoe UI" w:hAnsi="Segoe UI"/>
+                <w:color w:val="222222"/>
+                <w:sz w:val="17"/>
               </w:rPr>
               <w:t>105 hours</w:t>
             </w:r>
@@ -1989,23 +1847,21 @@
         </w:tc>
         <w:tc>
           <w:tcPr>
-            <w:tcW w:type="dxa" w:w="1872"/>
+            <w:tcW w:type="dxa" w:w="1930"/>
             <w:tcMar>
-              <w:top w:w="80" w:type="dxa"/>
-              <w:bottom w:w="80" w:type="dxa"/>
-              <w:left w:w="150" w:type="dxa"/>
-              <w:right w:w="150" w:type="dxa"/>
+              <w:top w:w="100" w:type="dxa"/>
+              <w:bottom w:w="100" w:type="dxa"/>
+              <w:left w:w="120" w:type="dxa"/>
+              <w:right w:w="120" w:type="dxa"/>
             </w:tcMar>
+            <w:shd w:fill="FAF7F2"/>
           </w:tcPr>
           <w:p>
-            <w:pPr>
-              <w:spacing w:before="40" w:after="40"/>
-            </w:pPr>
             <w:r>
               <w:rPr>
-                <w:rFonts w:ascii="Calibri" w:hAnsi="Calibri"/>
-                <w:color w:val="333333"/>
-                <w:sz w:val="18"/>
+                <w:rFonts w:ascii="Segoe UI" w:hAnsi="Segoe UI"/>
+                <w:color w:val="222222"/>
+                <w:sz w:val="17"/>
               </w:rPr>
               <w:t>LKR 1,500</w:t>
             </w:r>
@@ -2013,23 +1869,21 @@
         </w:tc>
         <w:tc>
           <w:tcPr>
-            <w:tcW w:type="dxa" w:w="1872"/>
+            <w:tcW w:type="dxa" w:w="1930"/>
             <w:tcMar>
-              <w:top w:w="80" w:type="dxa"/>
-              <w:bottom w:w="80" w:type="dxa"/>
-              <w:left w:w="150" w:type="dxa"/>
-              <w:right w:w="150" w:type="dxa"/>
+              <w:top w:w="100" w:type="dxa"/>
+              <w:bottom w:w="100" w:type="dxa"/>
+              <w:left w:w="120" w:type="dxa"/>
+              <w:right w:w="120" w:type="dxa"/>
             </w:tcMar>
+            <w:shd w:fill="FAF7F2"/>
           </w:tcPr>
           <w:p>
-            <w:pPr>
-              <w:spacing w:before="40" w:after="40"/>
-            </w:pPr>
             <w:r>
               <w:rPr>
-                <w:rFonts w:ascii="Calibri" w:hAnsi="Calibri"/>
-                <w:color w:val="333333"/>
-                <w:sz w:val="18"/>
+                <w:rFonts w:ascii="Segoe UI" w:hAnsi="Segoe UI"/>
+                <w:color w:val="222222"/>
+                <w:sz w:val="17"/>
               </w:rPr>
               <w:t>LKR 157,500</w:t>
             </w:r>
@@ -2039,49 +1893,41 @@
       <w:tr>
         <w:tc>
           <w:tcPr>
-            <w:tcW w:type="dxa" w:w="1872"/>
-            <w:shd w:fill="FBF8F9"/>
+            <w:tcW w:type="dxa" w:w="1930"/>
             <w:tcMar>
-              <w:top w:w="80" w:type="dxa"/>
-              <w:bottom w:w="80" w:type="dxa"/>
-              <w:left w:w="150" w:type="dxa"/>
-              <w:right w:w="150" w:type="dxa"/>
+              <w:top w:w="100" w:type="dxa"/>
+              <w:bottom w:w="100" w:type="dxa"/>
+              <w:left w:w="120" w:type="dxa"/>
+              <w:right w:w="120" w:type="dxa"/>
             </w:tcMar>
           </w:tcPr>
           <w:p>
-            <w:pPr>
-              <w:spacing w:before="40" w:after="40"/>
-            </w:pPr>
             <w:r>
               <w:rPr>
-                <w:rFonts w:ascii="Calibri" w:hAnsi="Calibri"/>
-                <w:color w:val="333333"/>
-                <w:sz w:val="18"/>
+                <w:rFonts w:ascii="Segoe UI" w:hAnsi="Segoe UI"/>
+                <w:color w:val="222222"/>
+                <w:sz w:val="17"/>
               </w:rPr>
-              <w:t>S.A.A. Lakmal</w:t>
+              <w:t>**S.A.A. Lakmal**</w:t>
             </w:r>
           </w:p>
         </w:tc>
         <w:tc>
           <w:tcPr>
-            <w:tcW w:type="dxa" w:w="1872"/>
-            <w:shd w:fill="FBF8F9"/>
+            <w:tcW w:type="dxa" w:w="1930"/>
             <w:tcMar>
-              <w:top w:w="80" w:type="dxa"/>
-              <w:bottom w:w="80" w:type="dxa"/>
-              <w:left w:w="150" w:type="dxa"/>
-              <w:right w:w="150" w:type="dxa"/>
+              <w:top w:w="100" w:type="dxa"/>
+              <w:bottom w:w="100" w:type="dxa"/>
+              <w:left w:w="120" w:type="dxa"/>
+              <w:right w:w="120" w:type="dxa"/>
             </w:tcMar>
           </w:tcPr>
           <w:p>
-            <w:pPr>
-              <w:spacing w:before="40" w:after="40"/>
-            </w:pPr>
             <w:r>
               <w:rPr>
-                <w:rFonts w:ascii="Calibri" w:hAnsi="Calibri"/>
-                <w:color w:val="333333"/>
-                <w:sz w:val="18"/>
+                <w:rFonts w:ascii="Segoe UI" w:hAnsi="Segoe UI"/>
+                <w:color w:val="222222"/>
+                <w:sz w:val="17"/>
               </w:rPr>
               <w:t>Backend Lead Developer (Spring Boot)</w:t>
             </w:r>
@@ -2089,24 +1935,20 @@
         </w:tc>
         <w:tc>
           <w:tcPr>
-            <w:tcW w:type="dxa" w:w="1872"/>
-            <w:shd w:fill="FBF8F9"/>
+            <w:tcW w:type="dxa" w:w="1930"/>
             <w:tcMar>
-              <w:top w:w="80" w:type="dxa"/>
-              <w:bottom w:w="80" w:type="dxa"/>
-              <w:left w:w="150" w:type="dxa"/>
-              <w:right w:w="150" w:type="dxa"/>
+              <w:top w:w="100" w:type="dxa"/>
+              <w:bottom w:w="100" w:type="dxa"/>
+              <w:left w:w="120" w:type="dxa"/>
+              <w:right w:w="120" w:type="dxa"/>
             </w:tcMar>
           </w:tcPr>
           <w:p>
-            <w:pPr>
-              <w:spacing w:before="40" w:after="40"/>
-            </w:pPr>
             <w:r>
               <w:rPr>
-                <w:rFonts w:ascii="Calibri" w:hAnsi="Calibri"/>
-                <w:color w:val="333333"/>
-                <w:sz w:val="18"/>
+                <w:rFonts w:ascii="Segoe UI" w:hAnsi="Segoe UI"/>
+                <w:color w:val="222222"/>
+                <w:sz w:val="17"/>
               </w:rPr>
               <w:t>100 hours</w:t>
             </w:r>
@@ -2114,24 +1956,20 @@
         </w:tc>
         <w:tc>
           <w:tcPr>
-            <w:tcW w:type="dxa" w:w="1872"/>
-            <w:shd w:fill="FBF8F9"/>
+            <w:tcW w:type="dxa" w:w="1930"/>
             <w:tcMar>
-              <w:top w:w="80" w:type="dxa"/>
-              <w:bottom w:w="80" w:type="dxa"/>
-              <w:left w:w="150" w:type="dxa"/>
-              <w:right w:w="150" w:type="dxa"/>
+              <w:top w:w="100" w:type="dxa"/>
+              <w:bottom w:w="100" w:type="dxa"/>
+              <w:left w:w="120" w:type="dxa"/>
+              <w:right w:w="120" w:type="dxa"/>
             </w:tcMar>
           </w:tcPr>
           <w:p>
-            <w:pPr>
-              <w:spacing w:before="40" w:after="40"/>
-            </w:pPr>
             <w:r>
               <w:rPr>
-                <w:rFonts w:ascii="Calibri" w:hAnsi="Calibri"/>
-                <w:color w:val="333333"/>
-                <w:sz w:val="18"/>
+                <w:rFonts w:ascii="Segoe UI" w:hAnsi="Segoe UI"/>
+                <w:color w:val="222222"/>
+                <w:sz w:val="17"/>
               </w:rPr>
               <w:t>LKR 1,500</w:t>
             </w:r>
@@ -2139,24 +1977,20 @@
         </w:tc>
         <w:tc>
           <w:tcPr>
-            <w:tcW w:type="dxa" w:w="1872"/>
-            <w:shd w:fill="FBF8F9"/>
+            <w:tcW w:type="dxa" w:w="1930"/>
             <w:tcMar>
-              <w:top w:w="80" w:type="dxa"/>
-              <w:bottom w:w="80" w:type="dxa"/>
-              <w:left w:w="150" w:type="dxa"/>
-              <w:right w:w="150" w:type="dxa"/>
+              <w:top w:w="100" w:type="dxa"/>
+              <w:bottom w:w="100" w:type="dxa"/>
+              <w:left w:w="120" w:type="dxa"/>
+              <w:right w:w="120" w:type="dxa"/>
             </w:tcMar>
           </w:tcPr>
           <w:p>
-            <w:pPr>
-              <w:spacing w:before="40" w:after="40"/>
-            </w:pPr>
             <w:r>
               <w:rPr>
-                <w:rFonts w:ascii="Calibri" w:hAnsi="Calibri"/>
-                <w:color w:val="333333"/>
-                <w:sz w:val="18"/>
+                <w:rFonts w:ascii="Segoe UI" w:hAnsi="Segoe UI"/>
+                <w:color w:val="222222"/>
+                <w:sz w:val="17"/>
               </w:rPr>
               <w:t>LKR 150,000</w:t>
             </w:r>
@@ -2166,47 +2000,43 @@
       <w:tr>
         <w:tc>
           <w:tcPr>
-            <w:tcW w:type="dxa" w:w="1872"/>
+            <w:tcW w:type="dxa" w:w="1930"/>
             <w:tcMar>
-              <w:top w:w="80" w:type="dxa"/>
-              <w:bottom w:w="80" w:type="dxa"/>
-              <w:left w:w="150" w:type="dxa"/>
-              <w:right w:w="150" w:type="dxa"/>
+              <w:top w:w="100" w:type="dxa"/>
+              <w:bottom w:w="100" w:type="dxa"/>
+              <w:left w:w="120" w:type="dxa"/>
+              <w:right w:w="120" w:type="dxa"/>
             </w:tcMar>
+            <w:shd w:fill="FAF7F2"/>
           </w:tcPr>
           <w:p>
-            <w:pPr>
-              <w:spacing w:before="40" w:after="40"/>
-            </w:pPr>
             <w:r>
               <w:rPr>
-                <w:rFonts w:ascii="Calibri" w:hAnsi="Calibri"/>
-                <w:color w:val="333333"/>
-                <w:sz w:val="18"/>
+                <w:rFonts w:ascii="Segoe UI" w:hAnsi="Segoe UI"/>
+                <w:color w:val="222222"/>
+                <w:sz w:val="17"/>
               </w:rPr>
-              <w:t>A.G.D.N. Ranathunga</w:t>
+              <w:t>**A.G.D.N. Ranathunga**</w:t>
             </w:r>
           </w:p>
         </w:tc>
         <w:tc>
           <w:tcPr>
-            <w:tcW w:type="dxa" w:w="1872"/>
+            <w:tcW w:type="dxa" w:w="1930"/>
             <w:tcMar>
-              <w:top w:w="80" w:type="dxa"/>
-              <w:bottom w:w="80" w:type="dxa"/>
-              <w:left w:w="150" w:type="dxa"/>
-              <w:right w:w="150" w:type="dxa"/>
+              <w:top w:w="100" w:type="dxa"/>
+              <w:bottom w:w="100" w:type="dxa"/>
+              <w:left w:w="120" w:type="dxa"/>
+              <w:right w:w="120" w:type="dxa"/>
             </w:tcMar>
+            <w:shd w:fill="FAF7F2"/>
           </w:tcPr>
           <w:p>
-            <w:pPr>
-              <w:spacing w:before="40" w:after="40"/>
-            </w:pPr>
             <w:r>
               <w:rPr>
-                <w:rFonts w:ascii="Calibri" w:hAnsi="Calibri"/>
-                <w:color w:val="333333"/>
-                <w:sz w:val="18"/>
+                <w:rFonts w:ascii="Segoe UI" w:hAnsi="Segoe UI"/>
+                <w:color w:val="222222"/>
+                <w:sz w:val="17"/>
               </w:rPr>
               <w:t>UI/UX Lead &amp; Frontend Developer</w:t>
             </w:r>
@@ -2214,23 +2044,21 @@
         </w:tc>
         <w:tc>
           <w:tcPr>
-            <w:tcW w:type="dxa" w:w="1872"/>
+            <w:tcW w:type="dxa" w:w="1930"/>
             <w:tcMar>
-              <w:top w:w="80" w:type="dxa"/>
-              <w:bottom w:w="80" w:type="dxa"/>
-              <w:left w:w="150" w:type="dxa"/>
-              <w:right w:w="150" w:type="dxa"/>
+              <w:top w:w="100" w:type="dxa"/>
+              <w:bottom w:w="100" w:type="dxa"/>
+              <w:left w:w="120" w:type="dxa"/>
+              <w:right w:w="120" w:type="dxa"/>
             </w:tcMar>
+            <w:shd w:fill="FAF7F2"/>
           </w:tcPr>
           <w:p>
-            <w:pPr>
-              <w:spacing w:before="40" w:after="40"/>
-            </w:pPr>
             <w:r>
               <w:rPr>
-                <w:rFonts w:ascii="Calibri" w:hAnsi="Calibri"/>
-                <w:color w:val="333333"/>
-                <w:sz w:val="18"/>
+                <w:rFonts w:ascii="Segoe UI" w:hAnsi="Segoe UI"/>
+                <w:color w:val="222222"/>
+                <w:sz w:val="17"/>
               </w:rPr>
               <w:t>95 hours</w:t>
             </w:r>
@@ -2238,23 +2066,21 @@
         </w:tc>
         <w:tc>
           <w:tcPr>
-            <w:tcW w:type="dxa" w:w="1872"/>
+            <w:tcW w:type="dxa" w:w="1930"/>
             <w:tcMar>
-              <w:top w:w="80" w:type="dxa"/>
-              <w:bottom w:w="80" w:type="dxa"/>
-              <w:left w:w="150" w:type="dxa"/>
-              <w:right w:w="150" w:type="dxa"/>
+              <w:top w:w="100" w:type="dxa"/>
+              <w:bottom w:w="100" w:type="dxa"/>
+              <w:left w:w="120" w:type="dxa"/>
+              <w:right w:w="120" w:type="dxa"/>
             </w:tcMar>
+            <w:shd w:fill="FAF7F2"/>
           </w:tcPr>
           <w:p>
-            <w:pPr>
-              <w:spacing w:before="40" w:after="40"/>
-            </w:pPr>
             <w:r>
               <w:rPr>
-                <w:rFonts w:ascii="Calibri" w:hAnsi="Calibri"/>
-                <w:color w:val="333333"/>
-                <w:sz w:val="18"/>
+                <w:rFonts w:ascii="Segoe UI" w:hAnsi="Segoe UI"/>
+                <w:color w:val="222222"/>
+                <w:sz w:val="17"/>
               </w:rPr>
               <w:t>LKR 1,500</w:t>
             </w:r>
@@ -2262,23 +2088,21 @@
         </w:tc>
         <w:tc>
           <w:tcPr>
-            <w:tcW w:type="dxa" w:w="1872"/>
+            <w:tcW w:type="dxa" w:w="1930"/>
             <w:tcMar>
-              <w:top w:w="80" w:type="dxa"/>
-              <w:bottom w:w="80" w:type="dxa"/>
-              <w:left w:w="150" w:type="dxa"/>
-              <w:right w:w="150" w:type="dxa"/>
+              <w:top w:w="100" w:type="dxa"/>
+              <w:bottom w:w="100" w:type="dxa"/>
+              <w:left w:w="120" w:type="dxa"/>
+              <w:right w:w="120" w:type="dxa"/>
             </w:tcMar>
+            <w:shd w:fill="FAF7F2"/>
           </w:tcPr>
           <w:p>
-            <w:pPr>
-              <w:spacing w:before="40" w:after="40"/>
-            </w:pPr>
             <w:r>
               <w:rPr>
-                <w:rFonts w:ascii="Calibri" w:hAnsi="Calibri"/>
-                <w:color w:val="333333"/>
-                <w:sz w:val="18"/>
+                <w:rFonts w:ascii="Segoe UI" w:hAnsi="Segoe UI"/>
+                <w:color w:val="222222"/>
+                <w:sz w:val="17"/>
               </w:rPr>
               <w:t>LKR 142,500</w:t>
             </w:r>
@@ -2288,49 +2112,41 @@
       <w:tr>
         <w:tc>
           <w:tcPr>
-            <w:tcW w:type="dxa" w:w="1872"/>
-            <w:shd w:fill="FBF8F9"/>
+            <w:tcW w:type="dxa" w:w="1930"/>
             <w:tcMar>
-              <w:top w:w="80" w:type="dxa"/>
-              <w:bottom w:w="80" w:type="dxa"/>
-              <w:left w:w="150" w:type="dxa"/>
-              <w:right w:w="150" w:type="dxa"/>
+              <w:top w:w="100" w:type="dxa"/>
+              <w:bottom w:w="100" w:type="dxa"/>
+              <w:left w:w="120" w:type="dxa"/>
+              <w:right w:w="120" w:type="dxa"/>
             </w:tcMar>
           </w:tcPr>
           <w:p>
-            <w:pPr>
-              <w:spacing w:before="40" w:after="40"/>
-            </w:pPr>
             <w:r>
               <w:rPr>
-                <w:rFonts w:ascii="Calibri" w:hAnsi="Calibri"/>
-                <w:color w:val="333333"/>
-                <w:sz w:val="18"/>
+                <w:rFonts w:ascii="Segoe UI" w:hAnsi="Segoe UI"/>
+                <w:color w:val="222222"/>
+                <w:sz w:val="17"/>
               </w:rPr>
-              <w:t>K.A.R.D. Sammani</w:t>
+              <w:t>**K.A.R.D. Sammani**</w:t>
             </w:r>
           </w:p>
         </w:tc>
         <w:tc>
           <w:tcPr>
-            <w:tcW w:type="dxa" w:w="1872"/>
-            <w:shd w:fill="FBF8F9"/>
+            <w:tcW w:type="dxa" w:w="1930"/>
             <w:tcMar>
-              <w:top w:w="80" w:type="dxa"/>
-              <w:bottom w:w="80" w:type="dxa"/>
-              <w:left w:w="150" w:type="dxa"/>
-              <w:right w:w="150" w:type="dxa"/>
+              <w:top w:w="100" w:type="dxa"/>
+              <w:bottom w:w="100" w:type="dxa"/>
+              <w:left w:w="120" w:type="dxa"/>
+              <w:right w:w="120" w:type="dxa"/>
             </w:tcMar>
           </w:tcPr>
           <w:p>
-            <w:pPr>
-              <w:spacing w:before="40" w:after="40"/>
-            </w:pPr>
             <w:r>
               <w:rPr>
-                <w:rFonts w:ascii="Calibri" w:hAnsi="Calibri"/>
-                <w:color w:val="333333"/>
-                <w:sz w:val="18"/>
+                <w:rFonts w:ascii="Segoe UI" w:hAnsi="Segoe UI"/>
+                <w:color w:val="222222"/>
+                <w:sz w:val="17"/>
               </w:rPr>
               <w:t>Database Engineer &amp; Business Analyst</w:t>
             </w:r>
@@ -2338,24 +2154,20 @@
         </w:tc>
         <w:tc>
           <w:tcPr>
-            <w:tcW w:type="dxa" w:w="1872"/>
-            <w:shd w:fill="FBF8F9"/>
+            <w:tcW w:type="dxa" w:w="1930"/>
             <w:tcMar>
-              <w:top w:w="80" w:type="dxa"/>
-              <w:bottom w:w="80" w:type="dxa"/>
-              <w:left w:w="150" w:type="dxa"/>
-              <w:right w:w="150" w:type="dxa"/>
+              <w:top w:w="100" w:type="dxa"/>
+              <w:bottom w:w="100" w:type="dxa"/>
+              <w:left w:w="120" w:type="dxa"/>
+              <w:right w:w="120" w:type="dxa"/>
             </w:tcMar>
           </w:tcPr>
           <w:p>
-            <w:pPr>
-              <w:spacing w:before="40" w:after="40"/>
-            </w:pPr>
             <w:r>
               <w:rPr>
-                <w:rFonts w:ascii="Calibri" w:hAnsi="Calibri"/>
-                <w:color w:val="333333"/>
-                <w:sz w:val="18"/>
+                <w:rFonts w:ascii="Segoe UI" w:hAnsi="Segoe UI"/>
+                <w:color w:val="222222"/>
+                <w:sz w:val="17"/>
               </w:rPr>
               <w:t>90 hours</w:t>
             </w:r>
@@ -2363,24 +2175,20 @@
         </w:tc>
         <w:tc>
           <w:tcPr>
-            <w:tcW w:type="dxa" w:w="1872"/>
-            <w:shd w:fill="FBF8F9"/>
+            <w:tcW w:type="dxa" w:w="1930"/>
             <w:tcMar>
-              <w:top w:w="80" w:type="dxa"/>
-              <w:bottom w:w="80" w:type="dxa"/>
-              <w:left w:w="150" w:type="dxa"/>
-              <w:right w:w="150" w:type="dxa"/>
+              <w:top w:w="100" w:type="dxa"/>
+              <w:bottom w:w="100" w:type="dxa"/>
+              <w:left w:w="120" w:type="dxa"/>
+              <w:right w:w="120" w:type="dxa"/>
             </w:tcMar>
           </w:tcPr>
           <w:p>
-            <w:pPr>
-              <w:spacing w:before="40" w:after="40"/>
-            </w:pPr>
             <w:r>
               <w:rPr>
-                <w:rFonts w:ascii="Calibri" w:hAnsi="Calibri"/>
-                <w:color w:val="333333"/>
-                <w:sz w:val="18"/>
+                <w:rFonts w:ascii="Segoe UI" w:hAnsi="Segoe UI"/>
+                <w:color w:val="222222"/>
+                <w:sz w:val="17"/>
               </w:rPr>
               <w:t>LKR 1,500</w:t>
             </w:r>
@@ -2388,24 +2196,20 @@
         </w:tc>
         <w:tc>
           <w:tcPr>
-            <w:tcW w:type="dxa" w:w="1872"/>
-            <w:shd w:fill="FBF8F9"/>
+            <w:tcW w:type="dxa" w:w="1930"/>
             <w:tcMar>
-              <w:top w:w="80" w:type="dxa"/>
-              <w:bottom w:w="80" w:type="dxa"/>
-              <w:left w:w="150" w:type="dxa"/>
-              <w:right w:w="150" w:type="dxa"/>
+              <w:top w:w="100" w:type="dxa"/>
+              <w:bottom w:w="100" w:type="dxa"/>
+              <w:left w:w="120" w:type="dxa"/>
+              <w:right w:w="120" w:type="dxa"/>
             </w:tcMar>
           </w:tcPr>
           <w:p>
-            <w:pPr>
-              <w:spacing w:before="40" w:after="40"/>
-            </w:pPr>
             <w:r>
               <w:rPr>
-                <w:rFonts w:ascii="Calibri" w:hAnsi="Calibri"/>
-                <w:color w:val="333333"/>
-                <w:sz w:val="18"/>
+                <w:rFonts w:ascii="Segoe UI" w:hAnsi="Segoe UI"/>
+                <w:color w:val="222222"/>
+                <w:sz w:val="17"/>
               </w:rPr>
               <w:t>LKR 135,000</w:t>
             </w:r>
@@ -2415,47 +2219,43 @@
       <w:tr>
         <w:tc>
           <w:tcPr>
-            <w:tcW w:type="dxa" w:w="1872"/>
+            <w:tcW w:type="dxa" w:w="1930"/>
             <w:tcMar>
-              <w:top w:w="80" w:type="dxa"/>
-              <w:bottom w:w="80" w:type="dxa"/>
-              <w:left w:w="150" w:type="dxa"/>
-              <w:right w:w="150" w:type="dxa"/>
+              <w:top w:w="100" w:type="dxa"/>
+              <w:bottom w:w="100" w:type="dxa"/>
+              <w:left w:w="120" w:type="dxa"/>
+              <w:right w:w="120" w:type="dxa"/>
             </w:tcMar>
+            <w:shd w:fill="FAF7F2"/>
           </w:tcPr>
           <w:p>
-            <w:pPr>
-              <w:spacing w:before="40" w:after="40"/>
-            </w:pPr>
             <w:r>
               <w:rPr>
-                <w:rFonts w:ascii="Calibri" w:hAnsi="Calibri"/>
-                <w:color w:val="333333"/>
-                <w:sz w:val="18"/>
+                <w:rFonts w:ascii="Segoe UI" w:hAnsi="Segoe UI"/>
+                <w:color w:val="222222"/>
+                <w:sz w:val="17"/>
               </w:rPr>
-              <w:t>V.G. Ruchira Nimnaka</w:t>
+              <w:t>**V.G. Ruchira Nimnaka**</w:t>
             </w:r>
           </w:p>
         </w:tc>
         <w:tc>
           <w:tcPr>
-            <w:tcW w:type="dxa" w:w="1872"/>
+            <w:tcW w:type="dxa" w:w="1930"/>
             <w:tcMar>
-              <w:top w:w="80" w:type="dxa"/>
-              <w:bottom w:w="80" w:type="dxa"/>
-              <w:left w:w="150" w:type="dxa"/>
-              <w:right w:w="150" w:type="dxa"/>
+              <w:top w:w="100" w:type="dxa"/>
+              <w:bottom w:w="100" w:type="dxa"/>
+              <w:left w:w="120" w:type="dxa"/>
+              <w:right w:w="120" w:type="dxa"/>
             </w:tcMar>
+            <w:shd w:fill="FAF7F2"/>
           </w:tcPr>
           <w:p>
-            <w:pPr>
-              <w:spacing w:before="40" w:after="40"/>
-            </w:pPr>
             <w:r>
               <w:rPr>
-                <w:rFonts w:ascii="Calibri" w:hAnsi="Calibri"/>
-                <w:color w:val="333333"/>
-                <w:sz w:val="18"/>
+                <w:rFonts w:ascii="Segoe UI" w:hAnsi="Segoe UI"/>
+                <w:color w:val="222222"/>
+                <w:sz w:val="17"/>
               </w:rPr>
               <w:t>Quality Assurance Lead Engineer</w:t>
             </w:r>
@@ -2463,23 +2263,21 @@
         </w:tc>
         <w:tc>
           <w:tcPr>
-            <w:tcW w:type="dxa" w:w="1872"/>
+            <w:tcW w:type="dxa" w:w="1930"/>
             <w:tcMar>
-              <w:top w:w="80" w:type="dxa"/>
-              <w:bottom w:w="80" w:type="dxa"/>
-              <w:left w:w="150" w:type="dxa"/>
-              <w:right w:w="150" w:type="dxa"/>
+              <w:top w:w="100" w:type="dxa"/>
+              <w:bottom w:w="100" w:type="dxa"/>
+              <w:left w:w="120" w:type="dxa"/>
+              <w:right w:w="120" w:type="dxa"/>
             </w:tcMar>
+            <w:shd w:fill="FAF7F2"/>
           </w:tcPr>
           <w:p>
-            <w:pPr>
-              <w:spacing w:before="40" w:after="40"/>
-            </w:pPr>
             <w:r>
               <w:rPr>
-                <w:rFonts w:ascii="Calibri" w:hAnsi="Calibri"/>
-                <w:color w:val="333333"/>
-                <w:sz w:val="18"/>
+                <w:rFonts w:ascii="Segoe UI" w:hAnsi="Segoe UI"/>
+                <w:color w:val="222222"/>
+                <w:sz w:val="17"/>
               </w:rPr>
               <w:t>90 hours</w:t>
             </w:r>
@@ -2487,23 +2285,21 @@
         </w:tc>
         <w:tc>
           <w:tcPr>
-            <w:tcW w:type="dxa" w:w="1872"/>
+            <w:tcW w:type="dxa" w:w="1930"/>
             <w:tcMar>
-              <w:top w:w="80" w:type="dxa"/>
-              <w:bottom w:w="80" w:type="dxa"/>
-              <w:left w:w="150" w:type="dxa"/>
-              <w:right w:w="150" w:type="dxa"/>
+              <w:top w:w="100" w:type="dxa"/>
+              <w:bottom w:w="100" w:type="dxa"/>
+              <w:left w:w="120" w:type="dxa"/>
+              <w:right w:w="120" w:type="dxa"/>
             </w:tcMar>
+            <w:shd w:fill="FAF7F2"/>
           </w:tcPr>
           <w:p>
-            <w:pPr>
-              <w:spacing w:before="40" w:after="40"/>
-            </w:pPr>
             <w:r>
               <w:rPr>
-                <w:rFonts w:ascii="Calibri" w:hAnsi="Calibri"/>
-                <w:color w:val="333333"/>
-                <w:sz w:val="18"/>
+                <w:rFonts w:ascii="Segoe UI" w:hAnsi="Segoe UI"/>
+                <w:color w:val="222222"/>
+                <w:sz w:val="17"/>
               </w:rPr>
               <w:t>LKR 1,500</w:t>
             </w:r>
@@ -2511,23 +2307,21 @@
         </w:tc>
         <w:tc>
           <w:tcPr>
-            <w:tcW w:type="dxa" w:w="1872"/>
+            <w:tcW w:type="dxa" w:w="1930"/>
             <w:tcMar>
-              <w:top w:w="80" w:type="dxa"/>
-              <w:bottom w:w="80" w:type="dxa"/>
-              <w:left w:w="150" w:type="dxa"/>
-              <w:right w:w="150" w:type="dxa"/>
+              <w:top w:w="100" w:type="dxa"/>
+              <w:bottom w:w="100" w:type="dxa"/>
+              <w:left w:w="120" w:type="dxa"/>
+              <w:right w:w="120" w:type="dxa"/>
             </w:tcMar>
+            <w:shd w:fill="FAF7F2"/>
           </w:tcPr>
           <w:p>
-            <w:pPr>
-              <w:spacing w:before="40" w:after="40"/>
-            </w:pPr>
             <w:r>
               <w:rPr>
-                <w:rFonts w:ascii="Calibri" w:hAnsi="Calibri"/>
-                <w:color w:val="333333"/>
-                <w:sz w:val="18"/>
+                <w:rFonts w:ascii="Segoe UI" w:hAnsi="Segoe UI"/>
+                <w:color w:val="222222"/>
+                <w:sz w:val="17"/>
               </w:rPr>
               <w:t>LKR 135,000</w:t>
             </w:r>
@@ -2537,126 +2331,106 @@
       <w:tr>
         <w:tc>
           <w:tcPr>
-            <w:tcW w:type="dxa" w:w="1872"/>
-            <w:shd w:fill="FBF8F9"/>
+            <w:tcW w:type="dxa" w:w="1930"/>
             <w:tcMar>
-              <w:top w:w="80" w:type="dxa"/>
-              <w:bottom w:w="80" w:type="dxa"/>
-              <w:left w:w="150" w:type="dxa"/>
-              <w:right w:w="150" w:type="dxa"/>
+              <w:top w:w="100" w:type="dxa"/>
+              <w:bottom w:w="100" w:type="dxa"/>
+              <w:left w:w="120" w:type="dxa"/>
+              <w:right w:w="120" w:type="dxa"/>
             </w:tcMar>
           </w:tcPr>
           <w:p>
-            <w:pPr>
-              <w:spacing w:before="40" w:after="40"/>
-            </w:pPr>
             <w:r>
               <w:rPr>
-                <w:rFonts w:ascii="Calibri" w:hAnsi="Calibri"/>
-                <w:color w:val="333333"/>
-                <w:sz w:val="18"/>
+                <w:rFonts w:ascii="Segoe UI" w:hAnsi="Segoe UI"/>
+                <w:color w:val="222222"/>
+                <w:sz w:val="17"/>
               </w:rPr>
-              <w:t>Total Human Resource Effort</w:t>
+              <w:t>**Total Human Resource Effort**</w:t>
             </w:r>
           </w:p>
         </w:tc>
         <w:tc>
           <w:tcPr>
-            <w:tcW w:type="dxa" w:w="1872"/>
-            <w:shd w:fill="FBF8F9"/>
+            <w:tcW w:type="dxa" w:w="1930"/>
             <w:tcMar>
-              <w:top w:w="80" w:type="dxa"/>
-              <w:bottom w:w="80" w:type="dxa"/>
-              <w:left w:w="150" w:type="dxa"/>
-              <w:right w:w="150" w:type="dxa"/>
+              <w:top w:w="100" w:type="dxa"/>
+              <w:bottom w:w="100" w:type="dxa"/>
+              <w:left w:w="120" w:type="dxa"/>
+              <w:right w:w="120" w:type="dxa"/>
             </w:tcMar>
           </w:tcPr>
           <w:p>
-            <w:pPr>
-              <w:spacing w:before="40" w:after="40"/>
-            </w:pPr>
             <w:r>
               <w:rPr>
-                <w:rFonts w:ascii="Calibri" w:hAnsi="Calibri"/>
-                <w:color w:val="333333"/>
-                <w:sz w:val="18"/>
+                <w:rFonts w:ascii="Segoe UI" w:hAnsi="Segoe UI"/>
+                <w:color w:val="222222"/>
+                <w:sz w:val="17"/>
               </w:rPr>
-              <w:t>Full Team Allocation</w:t>
+              <w:t>**Full Team Allocation**</w:t>
             </w:r>
           </w:p>
         </w:tc>
         <w:tc>
           <w:tcPr>
-            <w:tcW w:type="dxa" w:w="1872"/>
-            <w:shd w:fill="FBF8F9"/>
+            <w:tcW w:type="dxa" w:w="1930"/>
             <w:tcMar>
-              <w:top w:w="80" w:type="dxa"/>
-              <w:bottom w:w="80" w:type="dxa"/>
-              <w:left w:w="150" w:type="dxa"/>
-              <w:right w:w="150" w:type="dxa"/>
+              <w:top w:w="100" w:type="dxa"/>
+              <w:bottom w:w="100" w:type="dxa"/>
+              <w:left w:w="120" w:type="dxa"/>
+              <w:right w:w="120" w:type="dxa"/>
             </w:tcMar>
           </w:tcPr>
           <w:p>
-            <w:pPr>
-              <w:spacing w:before="40" w:after="40"/>
-            </w:pPr>
             <w:r>
               <w:rPr>
-                <w:rFonts w:ascii="Calibri" w:hAnsi="Calibri"/>
-                <w:color w:val="333333"/>
-                <w:sz w:val="18"/>
+                <w:rFonts w:ascii="Segoe UI" w:hAnsi="Segoe UI"/>
+                <w:color w:val="222222"/>
+                <w:sz w:val="17"/>
               </w:rPr>
-              <w:t>480 hours</w:t>
+              <w:t>**480 hours**</w:t>
             </w:r>
           </w:p>
         </w:tc>
         <w:tc>
           <w:tcPr>
-            <w:tcW w:type="dxa" w:w="1872"/>
-            <w:shd w:fill="FBF8F9"/>
+            <w:tcW w:type="dxa" w:w="1930"/>
             <w:tcMar>
-              <w:top w:w="80" w:type="dxa"/>
-              <w:bottom w:w="80" w:type="dxa"/>
-              <w:left w:w="150" w:type="dxa"/>
-              <w:right w:w="150" w:type="dxa"/>
+              <w:top w:w="100" w:type="dxa"/>
+              <w:bottom w:w="100" w:type="dxa"/>
+              <w:left w:w="120" w:type="dxa"/>
+              <w:right w:w="120" w:type="dxa"/>
             </w:tcMar>
           </w:tcPr>
           <w:p>
-            <w:pPr>
-              <w:spacing w:before="40" w:after="40"/>
-            </w:pPr>
             <w:r>
               <w:rPr>
-                <w:rFonts w:ascii="Calibri" w:hAnsi="Calibri"/>
-                <w:color w:val="333333"/>
-                <w:sz w:val="18"/>
+                <w:rFonts w:ascii="Segoe UI" w:hAnsi="Segoe UI"/>
+                <w:color w:val="222222"/>
+                <w:sz w:val="17"/>
               </w:rPr>
-              <w:t>LKR 1,500</w:t>
+              <w:t>**LKR 1,500**</w:t>
             </w:r>
           </w:p>
         </w:tc>
         <w:tc>
           <w:tcPr>
-            <w:tcW w:type="dxa" w:w="1872"/>
-            <w:shd w:fill="FBF8F9"/>
+            <w:tcW w:type="dxa" w:w="1930"/>
             <w:tcMar>
-              <w:top w:w="80" w:type="dxa"/>
-              <w:bottom w:w="80" w:type="dxa"/>
-              <w:left w:w="150" w:type="dxa"/>
-              <w:right w:w="150" w:type="dxa"/>
+              <w:top w:w="100" w:type="dxa"/>
+              <w:bottom w:w="100" w:type="dxa"/>
+              <w:left w:w="120" w:type="dxa"/>
+              <w:right w:w="120" w:type="dxa"/>
             </w:tcMar>
           </w:tcPr>
           <w:p>
-            <w:pPr>
-              <w:spacing w:before="40" w:after="40"/>
-            </w:pPr>
             <w:r>
               <w:rPr>
-                <w:rFonts w:ascii="Calibri" w:hAnsi="Calibri"/>
-                <w:color w:val="333333"/>
-                <w:sz w:val="18"/>
+                <w:rFonts w:ascii="Segoe UI" w:hAnsi="Segoe UI"/>
+                <w:color w:val="222222"/>
+                <w:sz w:val="17"/>
               </w:rPr>
-              <w:t>LKR 720,000</w:t>
+              <w:t>**LKR 720,000**</w:t>
             </w:r>
           </w:p>
         </w:tc>
@@ -2669,35 +2443,32 @@
     </w:p>
     <w:p>
       <w:pPr>
-        <w:spacing w:before="40" w:after="80"/>
+        <w:spacing w:before="120" w:after="120"/>
       </w:pPr>
       <w:r>
         <w:rPr>
-          <w:rFonts w:ascii="Calibri" w:hAnsi="Calibri"/>
-          <w:color w:val="222222"/>
-          <w:sz w:val="20"/>
+          <w:color w:val="EEDDE0"/>
         </w:rPr>
-        <w:t>---</w:t>
+        <w:t>__________________________________________________________________________</w:t>
       </w:r>
     </w:p>
     <w:p>
       <w:pPr>
-        <w:pStyle w:val="Heading2"/>
-        <w:spacing w:before="200" w:after="80"/>
+        <w:spacing w:before="240" w:after="80"/>
       </w:pPr>
       <w:r>
         <w:rPr>
-          <w:rFonts w:ascii="Georgia" w:hAnsi="Georgia"/>
+          <w:rFonts w:ascii="Playfair Display" w:hAnsi="Playfair Display"/>
           <w:b/>
           <w:color w:val="721F3A"/>
-          <w:sz w:val="28"/>
+          <w:sz w:val="30"/>
         </w:rPr>
         <w:t>4. Business &amp; Commercialization Model</w:t>
       </w:r>
     </w:p>
     <w:p>
       <w:pPr>
-        <w:spacing w:before="80" w:after="120"/>
+        <w:spacing w:before="80" w:after="80"/>
         <w:ind w:left="288"/>
       </w:pPr>
       <w:r>
@@ -2737,111 +2508,240 @@
     </w:p>
     <w:p>
       <w:pPr>
-        <w:pStyle w:val="ListNumber"/>
-        <w:spacing w:before="20" w:after="40"/>
+        <w:spacing w:after="80"/>
       </w:pPr>
       <w:r>
         <w:rPr>
-          <w:rFonts w:ascii="Calibri" w:hAnsi="Calibri"/>
-          <w:sz w:val="20"/>
+          <w:rFonts w:ascii="Segoe UI" w:hAnsi="Segoe UI"/>
+          <w:color w:val="222222"/>
+          <w:sz w:val="19"/>
         </w:rPr>
-        <w:t>1. Freemium Vendor Subscriptions:</w:t>
+        <w:t xml:space="preserve">1. </w:t>
+      </w:r>
+      <w:r>
+        <w:rPr>
+          <w:rFonts w:ascii="Segoe UI" w:hAnsi="Segoe UI"/>
+          <w:b/>
+          <w:color w:val="222222"/>
+          <w:sz w:val="19"/>
+        </w:rPr>
+        <w:t>Freemium Vendor Subscriptions (Implemented &amp; Demonstrable):</w:t>
+      </w:r>
+      <w:r>
+        <w:rPr>
+          <w:rFonts w:ascii="Segoe UI" w:hAnsi="Segoe UI"/>
+          <w:color w:val="222222"/>
+          <w:sz w:val="19"/>
+        </w:rPr>
       </w:r>
     </w:p>
     <w:p>
       <w:pPr>
-        <w:spacing w:before="40" w:after="80"/>
+        <w:spacing w:after="80"/>
       </w:pPr>
       <w:r>
         <w:rPr>
-          <w:rFonts w:ascii="Calibri" w:hAnsi="Calibri"/>
+          <w:rFonts w:ascii="Segoe UI" w:hAnsi="Segoe UI"/>
           <w:color w:val="222222"/>
-          <w:sz w:val="20"/>
+          <w:sz w:val="19"/>
         </w:rPr>
-        <w:t>- Free Tier: Basic business listing in directory with standard search appearance.</w:t>
+        <w:t xml:space="preserve">- </w:t>
+      </w:r>
+      <w:r>
+        <w:rPr>
+          <w:rFonts w:ascii="Segoe UI" w:hAnsi="Segoe UI"/>
+          <w:b/>
+          <w:color w:val="222222"/>
+          <w:sz w:val="19"/>
+        </w:rPr>
+        <w:t>Free Tier (LKR 0/month):</w:t>
+      </w:r>
+      <w:r>
+        <w:rPr>
+          <w:rFonts w:ascii="Segoe UI" w:hAnsi="Segoe UI"/>
+          <w:color w:val="222222"/>
+          <w:sz w:val="19"/>
+        </w:rPr>
+        <w:t xml:space="preserve"> Basic business listing in public directory, standard search appearance, and customer inquiry reception.</w:t>
       </w:r>
     </w:p>
     <w:p>
       <w:pPr>
-        <w:spacing w:before="40" w:after="80"/>
+        <w:spacing w:after="80"/>
       </w:pPr>
       <w:r>
         <w:rPr>
-          <w:rFonts w:ascii="Calibri" w:hAnsi="Calibri"/>
+          <w:rFonts w:ascii="Segoe UI" w:hAnsi="Segoe UI"/>
           <w:color w:val="222222"/>
-          <w:sz w:val="20"/>
+          <w:sz w:val="19"/>
         </w:rPr>
-        <w:t>- Pro Tier (LKR 2,500/month): Verified checkmark badge, customer inquiry analytics, contact number priority.</w:t>
+        <w:t xml:space="preserve">- </w:t>
+      </w:r>
+      <w:r>
+        <w:rPr>
+          <w:rFonts w:ascii="Segoe UI" w:hAnsi="Segoe UI"/>
+          <w:b/>
+          <w:color w:val="222222"/>
+          <w:sz w:val="19"/>
+        </w:rPr>
+        <w:t>Pro Tier (LKR 2,500/month):</w:t>
+      </w:r>
+      <w:r>
+        <w:rPr>
+          <w:rFonts w:ascii="Segoe UI" w:hAnsi="Segoe UI"/>
+          <w:color w:val="222222"/>
+          <w:sz w:val="19"/>
+        </w:rPr>
+        <w:t xml:space="preserve"> Verified Blue Checkmark badge, customer inquiry analytics, contact number priority, and lead tracking.</w:t>
       </w:r>
     </w:p>
     <w:p>
       <w:pPr>
-        <w:spacing w:before="40" w:after="80"/>
+        <w:spacing w:after="80"/>
       </w:pPr>
       <w:r>
         <w:rPr>
-          <w:rFonts w:ascii="Calibri" w:hAnsi="Calibri"/>
+          <w:rFonts w:ascii="Segoe UI" w:hAnsi="Segoe UI"/>
           <w:color w:val="222222"/>
-          <w:sz w:val="20"/>
+          <w:sz w:val="19"/>
         </w:rPr>
-        <w:t>- Featured Tier (LKR 5,000/month): Top-of-category placement, featured badge, highlighted card on landing page.</w:t>
+        <w:t xml:space="preserve">- </w:t>
+      </w:r>
+      <w:r>
+        <w:rPr>
+          <w:rFonts w:ascii="Segoe UI" w:hAnsi="Segoe UI"/>
+          <w:b/>
+          <w:color w:val="222222"/>
+          <w:sz w:val="19"/>
+        </w:rPr>
+        <w:t>Featured Tier (LKR 5,000/month):</w:t>
+      </w:r>
+      <w:r>
+        <w:rPr>
+          <w:rFonts w:ascii="Segoe UI" w:hAnsi="Segoe UI"/>
+          <w:color w:val="222222"/>
+          <w:sz w:val="19"/>
+        </w:rPr>
+        <w:t xml:space="preserve"> Top-of-category placement, Gold Featured card badge, landing page showcase highlight, and verified checkmark.</w:t>
       </w:r>
     </w:p>
     <w:p>
       <w:pPr>
-        <w:pStyle w:val="ListNumber"/>
-        <w:spacing w:before="20" w:after="40"/>
+        <w:spacing w:after="80"/>
       </w:pPr>
       <w:r>
         <w:rPr>
-          <w:rFonts w:ascii="Calibri" w:hAnsi="Calibri"/>
-          <w:sz w:val="20"/>
+          <w:rFonts w:ascii="Segoe UI" w:hAnsi="Segoe UI"/>
+          <w:color w:val="222222"/>
+          <w:sz w:val="19"/>
         </w:rPr>
-        <w:t>2. Booking Commission / Lead Generation:</w:t>
+        <w:t xml:space="preserve">- *Implementation Note:* In the current software release, the commercial subscription selection, payment verification, and badge provisioning workflow is fully implemented via an interactive </w:t>
+      </w:r>
+      <w:r>
+        <w:rPr>
+          <w:rFonts w:ascii="Segoe UI" w:hAnsi="Segoe UI"/>
+          <w:b/>
+          <w:color w:val="222222"/>
+          <w:sz w:val="19"/>
+        </w:rPr>
+        <w:t>Simulated Payment Sandbox Gateway</w:t>
+      </w:r>
+      <w:r>
+        <w:rPr>
+          <w:rFonts w:ascii="Segoe UI" w:hAnsi="Segoe UI"/>
+          <w:color w:val="222222"/>
+          <w:sz w:val="19"/>
+        </w:rPr>
+        <w:t xml:space="preserve"> (`/vendors/new` and `/vendor/dashboard`), enabling full evaluation of the monetization pipeline without live credit card merchant fees.</w:t>
       </w:r>
     </w:p>
     <w:p>
       <w:pPr>
-        <w:spacing w:before="40" w:after="80"/>
+        <w:spacing w:after="80"/>
       </w:pPr>
       <w:r>
         <w:rPr>
-          <w:rFonts w:ascii="Calibri" w:hAnsi="Calibri"/>
+          <w:rFonts w:ascii="Segoe UI" w:hAnsi="Segoe UI"/>
           <w:color w:val="222222"/>
-          <w:sz w:val="20"/>
+          <w:sz w:val="19"/>
         </w:rPr>
-        <w:t>- 2.5% to 5.0% commission charged to vendors upon successful booking confirmation facilitated through the platform cart.</w:t>
+        <w:t xml:space="preserve">2. </w:t>
+      </w:r>
+      <w:r>
+        <w:rPr>
+          <w:rFonts w:ascii="Segoe UI" w:hAnsi="Segoe UI"/>
+          <w:b/>
+          <w:color w:val="222222"/>
+          <w:sz w:val="19"/>
+        </w:rPr>
+        <w:t>Booking Commission / Lead Generation:</w:t>
+      </w:r>
+      <w:r>
+        <w:rPr>
+          <w:rFonts w:ascii="Segoe UI" w:hAnsi="Segoe UI"/>
+          <w:color w:val="222222"/>
+          <w:sz w:val="19"/>
+        </w:rPr>
       </w:r>
     </w:p>
     <w:p>
       <w:pPr>
-        <w:pStyle w:val="ListNumber"/>
-        <w:spacing w:before="20" w:after="40"/>
+        <w:spacing w:after="80"/>
       </w:pPr>
       <w:r>
         <w:rPr>
-          <w:rFonts w:ascii="Calibri" w:hAnsi="Calibri"/>
-          <w:sz w:val="20"/>
+          <w:rFonts w:ascii="Segoe UI" w:hAnsi="Segoe UI"/>
+          <w:color w:val="222222"/>
+          <w:sz w:val="19"/>
         </w:rPr>
-        <w:t>3. Category Sponsorships:</w:t>
+        <w:t>- 2.5% to 5.0% commission charged to vendors upon successful booking confirmation facilitated through the multi-vendor selection cart.</w:t>
       </w:r>
     </w:p>
     <w:p>
       <w:pPr>
-        <w:spacing w:before="40" w:after="80"/>
+        <w:spacing w:after="80"/>
       </w:pPr>
       <w:r>
         <w:rPr>
-          <w:rFonts w:ascii="Calibri" w:hAnsi="Calibri"/>
+          <w:rFonts w:ascii="Segoe UI" w:hAnsi="Segoe UI"/>
           <w:color w:val="222222"/>
-          <w:sz w:val="20"/>
+          <w:sz w:val="19"/>
+        </w:rPr>
+        <w:t xml:space="preserve">3. </w:t>
+      </w:r>
+      <w:r>
+        <w:rPr>
+          <w:rFonts w:ascii="Segoe UI" w:hAnsi="Segoe UI"/>
+          <w:b/>
+          <w:color w:val="222222"/>
+          <w:sz w:val="19"/>
+        </w:rPr>
+        <w:t>Category Sponsorships:</w:t>
+      </w:r>
+      <w:r>
+        <w:rPr>
+          <w:rFonts w:ascii="Segoe UI" w:hAnsi="Segoe UI"/>
+          <w:color w:val="222222"/>
+          <w:sz w:val="19"/>
+        </w:rPr>
+      </w:r>
+    </w:p>
+    <w:p>
+      <w:pPr>
+        <w:spacing w:after="80"/>
+      </w:pPr>
+      <w:r>
+        <w:rPr>
+          <w:rFonts w:ascii="Segoe UI" w:hAnsi="Segoe UI"/>
+          <w:color w:val="222222"/>
+          <w:sz w:val="19"/>
         </w:rPr>
         <w:t>- Sponsored banner placement for premier luxury hotels and wedding decor companies.</w:t>
       </w:r>
     </w:p>
     <w:sectPr>
       <w:pgSz w:w="12240" w:h="15840"/>
-      <w:pgMar w:top="1440" w:right="1440" w:bottom="1440" w:left="1440" w:header="720" w:footer="720" w:gutter="0"/>
+      <w:pgMar w:top="1152" w:right="1296" w:bottom="1152" w:left="1296" w:header="720" w:footer="720" w:gutter="0"/>
       <w:cols w:space="720"/>
       <w:docGrid w:linePitch="360"/>
     </w:sectPr>

</xml_diff>